<commit_message>
同步主仓库 wiki 更新 (340b084711c5737fd8032c4a0cd1fd902b510bf8)
</commit_message>
<xml_diff>
--- a/docs/sidequests/downloads/sidequest-scriptbook-20261004.docx
+++ b/docs/sidequests/downloads/sidequest-scriptbook-20261004.docx
@@ -44,7 +44,7 @@
       </w:pPr>
       <w:r>
         <w:rPr/>
-        <w:t xml:space="preserve">本版沿用任务001—096，保留原对白供查阅，新增修订流程、真实阶段条件和游戏内见闻。共266个条件阶段，其中6个可选分支；排版后335页见闻录。阶段数按不同解锁条件统计，同条件续页不重复计数。</w:t>
+        <w:t xml:space="preserve">本版沿用任务001—096，保留原对白供查阅，新增修订流程、真实阶段条件和游戏内见闻。共268个条件阶段，其中6个可选分支；排版后338页见闻录。阶段数按不同解锁条件统计，同条件续页不重复计数。</w:t>
       </w:r>
     </w:p>
     <w:p>
@@ -935,7 +935,7 @@
       </w:pPr>
       <w:r>
         <w:rPr/>
-        <w:t xml:space="preserve">老师与长老可按任意顺序拜访，分别读取0xB8F、0xB90。0xB94记录塔边事件；不把波波跃出写成已经治愈翅膀或成功飞翔。</w:t>
+        <w:t xml:space="preserve">老师与长老可按任意顺序拜访，分别读取0xB8F、0xB90。0xB94记录塔边事件。Award/src/award3.c两次过场分别设置0xB95、0xB96，记述波波借气流穿云与飞出大气层；不擅自补写翅膀痊愈或最终生死。</w:t>
       </w:r>
     </w:p>
     <w:p>
@@ -944,7 +944,7 @@
       </w:pPr>
       <w:r>
         <w:rPr/>
-        <w:t xml:space="preserve">共5个条件阶段（可选0个），5页详情。接取0xB8E；完成0xC04。</w:t>
+        <w:t xml:space="preserve">共7个条件阶段（可选0个），7页详情。接取0xB8E；完成0xC04。</w:t>
       </w:r>
     </w:p>
     <w:p>
@@ -1075,9 +1075,9 @@
         <w:br/>
         <w:t xml:space="preserve">波波却迎着狂风跃向了塔边。</w:t>
         <w:br/>
-        <w:t xml:space="preserve">我还记得阿速惊慌的呼喊。</w:t>
-        <w:br/>
-        <w:t xml:space="preserve">接下来。去塔顶见见他吧。</w:t>
+        <w:t xml:space="preserve">阿速惊慌地呼喊。想要阻止它。</w:t>
+        <w:br/>
+        <w:t xml:space="preserve">那小小的身影却没有停下。</w:t>
       </w:r>
     </w:p>
     <w:p>
@@ -1086,7 +1086,7 @@
       </w:pPr>
       <w:r>
         <w:rPr/>
-        <w:t xml:space="preserve">阶段5 · 自己的风景 · 0xC04</w:t>
+        <w:t xml:space="preserve">阶段5 · 抓住上升气流 · 0xB95</w:t>
       </w:r>
     </w:p>
     <w:p>
@@ -1102,6 +1102,68 @@
       </w:r>
       <w:r>
         <w:rPr/>
+        <w:t xml:space="preserve">波波拍打着残缺的翅膀。</w:t>
+        <w:br/>
+        <w:t xml:space="preserve">跌跌撞撞地向上攀升。</w:t>
+        <w:br/>
+        <w:t xml:space="preserve">它冲破灰云。抓住了上升气流。</w:t>
+        <w:br/>
+        <w:t xml:space="preserve">只是想触碰更高。更远的天空。</w:t>
+      </w:r>
+    </w:p>
+    <w:p>
+      <w:pPr>
+        <w:pStyle w:val="Small"/>
+      </w:pPr>
+      <w:r>
+        <w:rPr/>
+        <w:t xml:space="preserve">阶段6 · 天空之外 · 0xB96</w:t>
+      </w:r>
+    </w:p>
+    <w:p>
+      <w:pPr>
+        <w:pStyle w:val="Dialogue"/>
+      </w:pPr>
+      <w:r>
+        <w:rPr>
+          <w:b/>
+          <w:color w:val="215E66"/>
+        </w:rPr>
+        <w:t xml:space="preserve">我的见闻：</w:t>
+      </w:r>
+      <w:r>
+        <w:rPr/>
+        <w:t xml:space="preserve">波波飞出了大气层。</w:t>
+        <w:br/>
+        <w:t xml:space="preserve">眼中映着星球弧面与寂静的星空。</w:t>
+        <w:br/>
+        <w:t xml:space="preserve">即使缺氧。它仍追寻自己的自由。</w:t>
+        <w:br/>
+        <w:t xml:space="preserve">阿速明白了。鸟因为想飞才飞。</w:t>
+      </w:r>
+    </w:p>
+    <w:p>
+      <w:pPr>
+        <w:pStyle w:val="Small"/>
+      </w:pPr>
+      <w:r>
+        <w:rPr/>
+        <w:t xml:space="preserve">阶段7 · 自己的风景 · 0xC04</w:t>
+      </w:r>
+    </w:p>
+    <w:p>
+      <w:pPr>
+        <w:pStyle w:val="Dialogue"/>
+      </w:pPr>
+      <w:r>
+        <w:rPr>
+          <w:b/>
+          <w:color w:val="215E66"/>
+        </w:rPr>
+        <w:t xml:space="preserve">我的见闻：</w:t>
+      </w:r>
+      <w:r>
+        <w:rPr/>
         <w:t xml:space="preserve">塔顶的对战后。阿速终于笑了。</w:t>
         <w:br/>
         <w:t xml:space="preserve">他想飞。因为喜欢伙伴和蓝天。</w:t>
@@ -1571,6 +1633,273 @@
       </w:pPr>
       <w:r>
         <w:rPr/>
+        <w:t xml:space="preserve">源码过场一：穿云与上升气流</w:t>
+      </w:r>
+    </w:p>
+    <w:p>
+      <w:pPr>
+        <w:pStyle w:val="Note"/>
+      </w:pPr>
+      <w:r>
+        <w:rPr/>
+        <w:t xml:space="preserve">callasm 0x0896A661进入CB2_OpenAwardsMenus3。未设置0xB95时播放本段并设置0xB95，随后切换52.21。</w:t>
+      </w:r>
+    </w:p>
+    <w:p>
+      <w:pPr>
+        <w:pStyle w:val="Dialogue"/>
+      </w:pPr>
+      <w:r>
+        <w:rPr>
+          <w:b/>
+          <w:color w:val="215E66"/>
+        </w:rPr>
+        <w:t xml:space="preserve">旁白：</w:t>
+      </w:r>
+      <w:r>
+        <w:rPr/>
+        <w:t xml:space="preserve">波波在强风中几乎被吹翻,但它疯狂地拍打着那对残缺的翅膀.</w:t>
+        <w:br/>
+        <w:t xml:space="preserve"/>
+        <w:br/>
+        <w:t xml:space="preserve">不是为了捕食,不是为了逃跑.</w:t>
+        <w:br/>
+        <w:t xml:space="preserve"/>
+        <w:br/>
+        <w:t xml:space="preserve">它只是单纯地,甚至带着一丝疯狂与贪婪地,</w:t>
+        <w:br/>
+        <w:t xml:space="preserve"/>
+        <w:br/>
+        <w:t xml:space="preserve">想要触碰那个更高,更远的地方.</w:t>
+        <w:br/>
+        <w:t xml:space="preserve"/>
+        <w:br/>
+        <w:t xml:space="preserve">疼痛在每一寸神经中蔓延,但它的眼神却越来越亮.</w:t>
+        <w:br/>
+        <w:t xml:space="preserve"/>
+        <w:br/>
+        <w:t xml:space="preserve">它的飞行轨迹依然难看,跌跌撞撞,身姿摇摇欲坠,但却在真真切切地向上攀升.</w:t>
+        <w:br/>
+        <w:t xml:space="preserve"/>
+        <w:br/>
+        <w:t xml:space="preserve">它突破了盘旋在塔顶的气旋,突破了重力的重重枷锁.</w:t>
+        <w:br/>
+        <w:t xml:space="preserve"/>
+        <w:br/>
+        <w:t xml:space="preserve">小小的身躯像一支不屈的箭矢,冲破了厚重的灰色云层.</w:t>
+        <w:br/>
+        <w:t xml:space="preserve"/>
+        <w:br/>
+        <w:t xml:space="preserve">终于………在无数次的跌撞与濒死挣扎中,</w:t>
+        <w:br/>
+        <w:t xml:space="preserve"/>
+        <w:br/>
+        <w:t xml:space="preserve">这只连正常起飞都做不到的残疾鸟儿………</w:t>
+        <w:br/>
+        <w:t xml:space="preserve"/>
+        <w:br/>
+        <w:t xml:space="preserve">死死地抓住了一股强劲的上升气流………</w:t>
+      </w:r>
+    </w:p>
+    <w:p>
+      <w:pPr>
+        <w:pStyle w:val="Small"/>
+      </w:pPr>
+      <w:r>
+        <w:rPr/>
+        <w:t xml:space="preserve">来源：c:Award/src/award3.c:sText_NavMenu_TaskCount40_Award3</w:t>
+      </w:r>
+    </w:p>
+    <w:p>
+      <w:pPr>
+        <w:pStyle w:val="Heading2"/>
+      </w:pPr>
+      <w:r>
+        <w:rPr/>
+        <w:t xml:space="preserve">塔顶接续：波波！？</w:t>
+      </w:r>
+    </w:p>
+    <w:p>
+      <w:pPr>
+        <w:pStyle w:val="Dialogue"/>
+      </w:pPr>
+      <w:r>
+        <w:rPr>
+          <w:b/>
+          <w:color w:val="215E66"/>
+        </w:rPr>
+        <w:t xml:space="preserve">阿速：</w:t>
+      </w:r>
+      <w:r>
+        <w:rPr/>
+        <w:t xml:space="preserve">波波！？</w:t>
+      </w:r>
+    </w:p>
+    <w:p>
+      <w:pPr>
+        <w:pStyle w:val="Small"/>
+      </w:pPr>
+      <w:r>
+        <w:rPr/>
+        <w:t xml:space="preserve">来源：t:08EEA52E</w:t>
+      </w:r>
+    </w:p>
+    <w:p>
+      <w:pPr>
+        <w:pStyle w:val="Heading2"/>
+      </w:pPr>
+      <w:r>
+        <w:rPr/>
+        <w:t xml:space="preserve">源码过场二：大气层之外</w:t>
+      </w:r>
+    </w:p>
+    <w:p>
+      <w:pPr>
+        <w:pStyle w:val="Note"/>
+      </w:pPr>
+      <w:r>
+        <w:rPr/>
+        <w:t xml:space="preserve">同一callasm入口在0xB95已设置时播放第二段并设置0xB96，再返回52.21。旁白记述缺氧与濒临崩溃，未交代最终生死。</w:t>
+      </w:r>
+    </w:p>
+    <w:p>
+      <w:pPr>
+        <w:pStyle w:val="Dialogue"/>
+      </w:pPr>
+      <w:r>
+        <w:rPr>
+          <w:b/>
+          <w:color w:val="215E66"/>
+        </w:rPr>
+        <w:t xml:space="preserve">旁白：</w:t>
+      </w:r>
+      <w:r>
+        <w:rPr/>
+        <w:t xml:space="preserve">于是………它一路向上.</w:t>
+        <w:br/>
+        <w:t xml:space="preserve"/>
+        <w:br/>
+        <w:t xml:space="preserve">飞到了一个比这个世界上任何一只正常波波都飞得要高的地方.</w:t>
+        <w:br/>
+        <w:t xml:space="preserve"/>
+        <w:br/>
+        <w:t xml:space="preserve">波波彻底挣脱了大气层的最后一道枷锁.</w:t>
+        <w:br/>
+        <w:t xml:space="preserve"/>
+        <w:br/>
+        <w:t xml:space="preserve">随着上升气流的余韵彻底消失,四周的喧嚣骤然沉寂,</w:t>
+        <w:br/>
+        <w:t xml:space="preserve"/>
+        <w:br/>
+        <w:t xml:space="preserve">取而代之的是一种近乎神圣的,永恒的静谧………</w:t>
+        <w:br/>
+        <w:t xml:space="preserve"/>
+        <w:br/>
+        <w:t xml:space="preserve">这是连最强壮的大比鸟也未曾企及的禁域.</w:t>
+        <w:br/>
+        <w:t xml:space="preserve"/>
+        <w:br/>
+        <w:t xml:space="preserve">波波那双因极度缺氧而渐渐失神的眼瞳中,倒映出此生最震撼的绝景.</w:t>
+        <w:br/>
+        <w:t xml:space="preserve"/>
+        <w:br/>
+        <w:t xml:space="preserve">下方是湛蓝如宝石,被大气层薄纱温柔包裹的星球弧面.</w:t>
+        <w:br/>
+        <w:t xml:space="preserve"/>
+        <w:br/>
+        <w:t xml:space="preserve">而上方,则是深邃到令人战栗的纯黑真空中,</w:t>
+        <w:br/>
+        <w:t xml:space="preserve"/>
+        <w:br/>
+        <w:t xml:space="preserve">嵌满了不再闪烁,犹如恒久钻石般的星点.</w:t>
+        <w:br/>
+        <w:t xml:space="preserve"/>
+        <w:br/>
+        <w:t xml:space="preserve">这里没有风,没有声音.连氧气也早已消失殆尽.</w:t>
+        <w:br/>
+        <w:t xml:space="preserve"/>
+        <w:br/>
+        <w:t xml:space="preserve">尽管身体已经因为极度透支而濒临崩溃.</w:t>
+        <w:br/>
+        <w:t xml:space="preserve"/>
+        <w:br/>
+        <w:t xml:space="preserve">但是………它的灵魂却在这一刻得到了前所未有的自由.</w:t>
+      </w:r>
+    </w:p>
+    <w:p>
+      <w:pPr>
+        <w:pStyle w:val="Small"/>
+      </w:pPr>
+      <w:r>
+        <w:rPr/>
+        <w:t xml:space="preserve">来源：c:Award/src/award3.c:sText_NavMenu_TaskCount41_Award3</w:t>
+      </w:r>
+    </w:p>
+    <w:p>
+      <w:pPr>
+        <w:pStyle w:val="Heading2"/>
+      </w:pPr>
+      <w:r>
+        <w:rPr/>
+        <w:t xml:space="preserve">塔顶接续：鸟因为想飞才飞</w:t>
+      </w:r>
+    </w:p>
+    <w:p>
+      <w:pPr>
+        <w:pStyle w:val="Note"/>
+      </w:pPr>
+      <w:r>
+        <w:rPr/>
+        <w:t xml:space="preserve">52.21入口检查0xB96，设置后进入阿速领悟与后续邀战。</w:t>
+      </w:r>
+    </w:p>
+    <w:p>
+      <w:pPr>
+        <w:pStyle w:val="Dialogue"/>
+      </w:pPr>
+      <w:r>
+        <w:rPr>
+          <w:b/>
+          <w:color w:val="215E66"/>
+        </w:rPr>
+        <w:t xml:space="preserve">阿速：</w:t>
+      </w:r>
+      <w:r>
+        <w:rPr/>
+        <w:t xml:space="preserve">波波……原来是这样……</w:t>
+        <w:br/>
+        <w:t xml:space="preserve"/>
+        <w:br/>
+        <w:t xml:space="preserve">鸟为什么能在天空飞，我知道答案是什么了。</w:t>
+        <w:br/>
+        <w:t xml:space="preserve"/>
+        <w:br/>
+        <w:t xml:space="preserve">鸟是因为想飞才在天空飞，不需要理由，就算有可能折翼而死也无所谓。</w:t>
+        <w:br/>
+        <w:t xml:space="preserve"/>
+        <w:br/>
+        <w:t xml:space="preserve">不是为了任何人，也不是为任何人的命令，鸟只是因为自己想飞才在天空飞！</w:t>
+        <w:br/>
+        <w:t xml:space="preserve"/>
+        <w:br/>
+        <w:t xml:space="preserve">谢谢你……波波！</w:t>
+      </w:r>
+    </w:p>
+    <w:p>
+      <w:pPr>
+        <w:pStyle w:val="Small"/>
+      </w:pPr>
+      <w:r>
+        <w:rPr/>
+        <w:t xml:space="preserve">来源：t:08EEAE64</w:t>
+      </w:r>
+    </w:p>
+    <w:p>
+      <w:pPr>
+        <w:pStyle w:val="Heading2"/>
+      </w:pPr>
+      <w:r>
+        <w:rPr/>
         <w:t xml:space="preserve">塔顶对战：邀战与落败</w:t>
       </w:r>
     </w:p>
@@ -38389,7 +38718,7 @@
       </w:pPr>
       <w:r>
         <w:rPr/>
-        <w:t xml:space="preserve">0x1438完成千惠服装后转为回家找妈妈的目标，0x1439大会结束。不把未实装两条8bit支线当必经阶段。</w:t>
+        <w:t xml:space="preserve">0x1438完成千惠服装后转为回家找妈妈的目标，0x1439大会结束。52.36经callasm 0x0896A771进入award2/src/award2.c的sBg28Text，再切换52.37颁奖。不把未实装两条8bit支线当必经阶段。</w:t>
       </w:r>
     </w:p>
     <w:p>
@@ -38398,7 +38727,7 @@
       </w:pPr>
       <w:r>
         <w:rPr/>
-        <w:t xml:space="preserve">共3个条件阶段（可选0个），4页详情。接取0x1437；完成0x1439。</w:t>
+        <w:t xml:space="preserve">共3个条件阶段（可选0个），5页详情。接取0x1437；完成0x1439。</w:t>
       </w:r>
     </w:p>
     <w:p>
@@ -38530,6 +38859,37 @@
     </w:p>
     <w:p>
       <w:pPr>
+        <w:pStyle w:val="Small"/>
+      </w:pPr>
+      <w:r>
+        <w:rPr/>
+        <w:t xml:space="preserve">阶段3 · 方块世界里的祝福 · 0x1439</w:t>
+      </w:r>
+    </w:p>
+    <w:p>
+      <w:pPr>
+        <w:pStyle w:val="Dialogue"/>
+      </w:pPr>
+      <w:r>
+        <w:rPr>
+          <w:b/>
+          <w:color w:val="215E66"/>
+        </w:rPr>
+        <w:t xml:space="preserve">我的见闻：</w:t>
+      </w:r>
+      <w:r>
+        <w:rPr/>
+        <w:t xml:space="preserve">评委也变成了小小的方块。</w:t>
+        <w:br/>
+        <w:t xml:space="preserve">胡桃说。衣服唤醒了大家的回忆。</w:t>
+        <w:br/>
+        <w:t xml:space="preserve">亲人和选手们纷纷向我道贺。</w:t>
+        <w:br/>
+        <w:t xml:space="preserve">我在祝福声中成为大会冠军。</w:t>
+      </w:r>
+    </w:p>
+    <w:p>
+      <w:pPr>
         <w:pStyle w:val="Heading2"/>
       </w:pPr>
       <w:r>
@@ -40222,6 +40582,121 @@
       <w:r>
         <w:rPr/>
         <w:t xml:space="preserve">来源：s:gText_TaskCosplay_JennyFinalContestant</w:t>
+      </w:r>
+    </w:p>
+    <w:p>
+      <w:pPr>
+        <w:pStyle w:val="Heading2"/>
+      </w:pPr>
+      <w:r>
+        <w:rPr/>
+        <w:t xml:space="preserve">源码过场：像素化世界与冠军祝福</w:t>
+      </w:r>
+    </w:p>
+    <w:p>
+      <w:pPr>
+        <w:pStyle w:val="Note"/>
+      </w:pPr>
+      <w:r>
+        <w:rPr/>
+        <w:t xml:space="preserve">52.36的演出末尾callasm 0x0896A771进入CB2_OpenAwardsMenus2。入口按当前地图选择BG28模式，播放sBg28Text后切换52.37颁奖；源码内的复用文本备注按原文保留。</w:t>
+      </w:r>
+    </w:p>
+    <w:p>
+      <w:pPr>
+        <w:pStyle w:val="Dialogue"/>
+      </w:pPr>
+      <w:r>
+        <w:rPr>
+          <w:b/>
+          <w:color w:val="215E66"/>
+        </w:rPr>
+        <w:t xml:space="preserve">乔伊小姐、君莎小姐、须木佐、胡桃与亲友：</w:t>
+      </w:r>
+      <w:r>
+        <w:rPr/>
+        <w:t xml:space="preserve">乔伊小姐：哎呀!大家快看………我们的样子也变了!</w:t>
+        <w:br/>
+        <w:t xml:space="preserve"/>
+        <w:br/>
+        <w:t xml:space="preserve">君莎小姐：制服的细节全都不见了,变成了一个个小方格………</w:t>
+        <w:br/>
+        <w:t xml:space="preserve"/>
+        <w:br/>
+        <w:t xml:space="preserve">须木佐：这个我最喜欢了啊!!Suki! SuKi!Daisuki!!!</w:t>
+        <w:br/>
+        <w:t xml:space="preserve"/>
+        <w:br/>
+        <w:t xml:space="preserve">胡桃：看来,这套不可思议的服装</w:t>
+        <w:br/>
+        <w:t xml:space="preserve"/>
+        <w:br/>
+        <w:t xml:space="preserve">彻底唤醒了所有人心底的记忆!</w:t>
+        <w:br/>
+        <w:t xml:space="preserve"/>
+        <w:br/>
+        <w:t xml:space="preserve">乔伊小姐：毫无悬念!</w:t>
+        <w:br/>
+        <w:t xml:space="preserve"/>
+        <w:br/>
+        <w:t xml:space="preserve">君莎小姐：这场比赛的冠军!</w:t>
+        <w:br/>
+        <w:t xml:space="preserve"/>
+        <w:br/>
+        <w:t xml:space="preserve">胡桃：就是带我们找回初心的你!</w:t>
+        <w:br/>
+        <w:t xml:space="preserve"/>
+        <w:br/>
+        <w:t xml:space="preserve">须木佐：这个我最喜欢了啊!</w:t>
+        <w:br/>
+        <w:t xml:space="preserve"/>
+        <w:br/>
+        <w:t xml:space="preserve">妈妈：恭喜你!</w:t>
+        <w:br/>
+        <w:t xml:space="preserve"/>
+        <w:br/>
+        <w:t xml:space="preserve">岩铁：恭喜你,小鬼!</w:t>
+        <w:br/>
+        <w:t xml:space="preserve"/>
+        <w:br/>
+        <w:t xml:space="preserve">千惠：恭喜啦！好厉害！</w:t>
+        <w:br/>
+        <w:t xml:space="preserve"/>
+        <w:br/>
+        <w:t xml:space="preserve">露营少年（林克）：恭喜！</w:t>
+        <w:br/>
+        <w:t xml:space="preserve"/>
+        <w:br/>
+        <w:t xml:space="preserve">波加曼人：波加波加！（恭喜！）</w:t>
+        <w:br/>
+        <w:t xml:space="preserve"/>
+        <w:br/>
+        <w:t xml:space="preserve">小茜：恭喜你哦！</w:t>
+        <w:br/>
+        <w:t xml:space="preserve"/>
+        <w:br/>
+        <w:t xml:space="preserve">短裤少年：恭喜！（这句文本也是复用的）</w:t>
+        <w:br/>
+        <w:t xml:space="preserve"/>
+        <w:br/>
+        <w:t xml:space="preserve">谢谢大家!</w:t>
+        <w:br/>
+        <w:t xml:space="preserve"/>
+        <w:br/>
+        <w:t xml:space="preserve">在所有人的祝福声中,</w:t>
+        <w:br/>
+        <w:t xml:space="preserve"/>
+        <w:br/>
+        <w:t xml:space="preserve">恭喜!你赢得了满金Cosplay大赛冠军!</w:t>
+      </w:r>
+    </w:p>
+    <w:p>
+      <w:pPr>
+        <w:pStyle w:val="Small"/>
+      </w:pPr>
+      <w:r>
+        <w:rPr/>
+        <w:t xml:space="preserve">来源：c:award2/src/award2.c:sBg28Text</w:t>
       </w:r>
     </w:p>
     <w:p>

</xml_diff>

<commit_message>
同步主仓库 wiki 更新 (1a2fa36c0d95e44917cea61d32541947a01055b6)
</commit_message>
<xml_diff>
--- a/docs/sidequests/downloads/sidequest-scriptbook-20261004.docx
+++ b/docs/sidequests/downloads/sidequest-scriptbook-20261004.docx
@@ -5927,23 +5927,328 @@
     </w:p>
     <w:p>
       <w:pPr>
+        <w:pStyle w:val="Normal"/>
+      </w:pPr>
+      <w:r>
+        <w:rPr/>
+        <w:t xml:space="preserve">开启下一阶段</w:t>
+      </w:r>
+    </w:p>
+    <w:p>
+      <w:pPr>
+        <w:pStyle w:val="Heading1"/>
+      </w:pPr>
+      <w:bookmarkStart w:id="7" w:name="task_007"/>
+      <w:r>
+        <w:rPr/>
+        <w:t xml:space="preserve">任务007 山顶的秘密</w:t>
+      </w:r>
+      <w:bookmarkEnd w:id="7"/>
+    </w:p>
+    <w:p>
+      <w:pPr>
         <w:pStyle w:val="Note"/>
       </w:pPr>
       <w:r>
         <w:rPr/>
-        <w:t xml:space="preserve">本阶段未见独立道具、金钱、宝可梦或点数发放；洗翠篇统一结算见任务011。</w:t>
+        <w:t xml:space="preserve">补回山顶三只围圈与裂缝触发。到洗翠后才完成本项，不在接取页预告穿越。</w:t>
+      </w:r>
+    </w:p>
+    <w:p>
+      <w:pPr>
+        <w:pStyle w:val="Normal"/>
+      </w:pPr>
+      <w:r>
+        <w:rPr/>
+        <w:t xml:space="preserve">共2个条件阶段（可选0个），2页详情。接取0xBCF；完成0xBD0。</w:t>
+      </w:r>
+    </w:p>
+    <w:p>
+      <w:pPr>
+        <w:pStyle w:val="Heading2"/>
+      </w:pPr>
+      <w:r>
+        <w:rPr/>
+        <w:t xml:space="preserve">修订流程与解锁条件</w:t>
+      </w:r>
+    </w:p>
+    <w:p>
+      <w:pPr>
+        <w:pStyle w:val="Small"/>
+      </w:pPr>
+      <w:r>
+        <w:rPr/>
+        <w:t xml:space="preserve">阶段1 · 追上伙伴 · 0xBCF</w:t>
+      </w:r>
+    </w:p>
+    <w:p>
+      <w:pPr>
+        <w:pStyle w:val="Dialogue"/>
+      </w:pPr>
+      <w:r>
+        <w:rPr>
+          <w:b/>
+          <w:color w:val="215E66"/>
+        </w:rPr>
+        <w:t xml:space="preserve">我的见闻：</w:t>
+      </w:r>
+      <w:r>
+        <w:rPr/>
+        <w:t xml:space="preserve">三只宝可梦忽然朝山顶跑去了。</w:t>
+        <w:br/>
+        <w:t xml:space="preserve">主人说那里的磁场很不寻常。</w:t>
+        <w:br/>
+        <w:t xml:space="preserve">我来不及多想。也赶紧追了过去。</w:t>
+        <w:br/>
+        <w:t xml:space="preserve">希望它们别遇上什么危险。</w:t>
+      </w:r>
+    </w:p>
+    <w:p>
+      <w:pPr>
+        <w:pStyle w:val="Small"/>
+      </w:pPr>
+      <w:r>
+        <w:rPr/>
+        <w:t xml:space="preserve">阶段2 · 扭曲的天空 · 0xBD0</w:t>
+      </w:r>
+    </w:p>
+    <w:p>
+      <w:pPr>
+        <w:pStyle w:val="Dialogue"/>
+      </w:pPr>
+      <w:r>
+        <w:rPr>
+          <w:b/>
+          <w:color w:val="215E66"/>
+        </w:rPr>
+        <w:t xml:space="preserve">我的见闻：</w:t>
+      </w:r>
+      <w:r>
+        <w:rPr/>
+        <w:t xml:space="preserve">我在山顶找到了那三个小家伙。</w:t>
+        <w:br/>
+        <w:t xml:space="preserve">可周围的时空突然开始扭曲。</w:t>
+        <w:br/>
+        <w:t xml:space="preserve">再睁开眼时。眼前已是一片冻土。</w:t>
+        <w:br/>
+        <w:t xml:space="preserve">我们究竟来到了什么地方？</w:t>
+      </w:r>
+    </w:p>
+    <w:p>
+      <w:pPr>
+        <w:pStyle w:val="Heading2"/>
+      </w:pPr>
+      <w:r>
+        <w:rPr/>
+        <w:t xml:space="preserve">场景对白与分支</w:t>
+      </w:r>
+    </w:p>
+    <w:p>
+      <w:pPr>
+        <w:pStyle w:val="Heading2"/>
+      </w:pPr>
+      <w:r>
+        <w:rPr/>
+        <w:t xml:space="preserve">追向山顶</w:t>
+      </w:r>
+    </w:p>
+    <w:p>
+      <w:pPr>
+        <w:pStyle w:val="Dialogue"/>
+      </w:pPr>
+      <w:r>
+        <w:rPr>
+          <w:b/>
+          <w:color w:val="215E66"/>
+        </w:rPr>
+        <w:t xml:space="preserve">委托人：</w:t>
+      </w:r>
+      <w:r>
+        <w:rPr/>
+        <w:t xml:space="preserve">难道！？它们要跑到山顶上去吗？</w:t>
+        <w:br/>
+        <w:t xml:space="preserve"/>
+        <w:br/>
+        <w:t xml:space="preserve">上面很危险！那里有强烈的磁场异常啊！</w:t>
+        <w:br/>
+        <w:t xml:space="preserve"/>
+        <w:br/>
+        <w:t xml:space="preserve">〔玩家名〕，快！我们得追上它们！</w:t>
+      </w:r>
+    </w:p>
+    <w:p>
+      <w:pPr>
+        <w:pStyle w:val="Dialogue"/>
+      </w:pPr>
+      <w:r>
+        <w:rPr>
+          <w:b/>
+          <w:color w:val="215E66"/>
+        </w:rPr>
+        <w:t xml:space="preserve">委托人：</w:t>
+      </w:r>
+      <w:r>
+        <w:rPr/>
+        <w:t xml:space="preserve">接受任务:&lt;山顶的秘密&gt;</w:t>
+      </w:r>
+    </w:p>
+    <w:p>
+      <w:pPr>
+        <w:pStyle w:val="Dialogue"/>
+      </w:pPr>
+      <w:r>
+        <w:rPr>
+          <w:b/>
+          <w:color w:val="215E66"/>
+        </w:rPr>
+        <w:t xml:space="preserve">委托人：</w:t>
+      </w:r>
+      <w:r>
+        <w:rPr/>
+        <w:t xml:space="preserve">三只宝可梦已经朝山顶跑去了。</w:t>
+        <w:br/>
+        <w:t xml:space="preserve"/>
+        <w:br/>
+        <w:t xml:space="preserve">赶快去山顶看看吧！</w:t>
+      </w:r>
+    </w:p>
+    <w:p>
+      <w:pPr>
+        <w:pStyle w:val="Heading2"/>
+      </w:pPr>
+      <w:r>
+        <w:rPr/>
+        <w:t xml:space="preserve">山顶：靠近三只伙伴</w:t>
+      </w:r>
+    </w:p>
+    <w:p>
+      <w:pPr>
+        <w:pStyle w:val="Dialogue"/>
+      </w:pPr>
+      <w:r>
+        <w:rPr>
+          <w:b/>
+          <w:color w:val="215E66"/>
+        </w:rPr>
+        <w:t xml:space="preserve">旁白：</w:t>
+      </w:r>
+      <w:r>
+        <w:rPr/>
+        <w:t xml:space="preserve">三只宝可梦并排着站在山顶。</w:t>
+        <w:br/>
+        <w:t xml:space="preserve"/>
+        <w:br/>
+        <w:t xml:space="preserve">你准备靠近它们。</w:t>
+      </w:r>
+    </w:p>
+    <w:p>
+      <w:pPr>
+        <w:pStyle w:val="Small"/>
+      </w:pPr>
+      <w:r>
+        <w:rPr/>
+        <w:t xml:space="preserve">来源：s:gText_TaskHisui_SummitFoundTrio</w:t>
+      </w:r>
+    </w:p>
+    <w:p>
+      <w:pPr>
+        <w:pStyle w:val="Heading2"/>
+      </w:pPr>
+      <w:r>
+        <w:rPr/>
+        <w:t xml:space="preserve">时空异常</w:t>
+      </w:r>
+    </w:p>
+    <w:p>
+      <w:pPr>
+        <w:pStyle w:val="Dialogue"/>
+      </w:pPr>
+      <w:r>
+        <w:rPr>
+          <w:b/>
+          <w:color w:val="215E66"/>
+        </w:rPr>
+        <w:t xml:space="preserve">旁白：</w:t>
+      </w:r>
+      <w:r>
+        <w:rPr/>
+        <w:t xml:space="preserve">周围的时空开始扭曲了！</w:t>
+        <w:br/>
+        <w:t xml:space="preserve"/>
+        <w:br/>
+        <w:t xml:space="preserve">〔玩家名〕失去了意识……</w:t>
+      </w:r>
+    </w:p>
+    <w:p>
+      <w:pPr>
+        <w:pStyle w:val="Heading2"/>
+      </w:pPr>
+      <w:r>
+        <w:rPr/>
+        <w:t xml:space="preserve">醒来：陌生的雪原</w:t>
+      </w:r>
+    </w:p>
+    <w:p>
+      <w:pPr>
+        <w:pStyle w:val="Dialogue"/>
+      </w:pPr>
+      <w:r>
+        <w:rPr>
+          <w:b/>
+          <w:color w:val="215E66"/>
+        </w:rPr>
+        <w:t xml:space="preserve">旁白：</w:t>
+      </w:r>
+      <w:r>
+        <w:rPr/>
+        <w:t xml:space="preserve">你再次醒来。你发现自己躺在</w:t>
+        <w:br/>
+        <w:t xml:space="preserve"/>
+        <w:br/>
+        <w:t xml:space="preserve">一片极其陌生的雪原中。</w:t>
+        <w:br/>
+        <w:t xml:space="preserve"/>
+        <w:br/>
+        <w:t xml:space="preserve">睁开眼，三只宝可梦就在眼前。</w:t>
+      </w:r>
+    </w:p>
+    <w:p>
+      <w:pPr>
+        <w:pStyle w:val="Small"/>
+      </w:pPr>
+      <w:r>
+        <w:rPr/>
+        <w:t xml:space="preserve">来源：s:gText_TaskHisui_HisuiWakeNarration</w:t>
+      </w:r>
+    </w:p>
+    <w:p>
+      <w:pPr>
+        <w:pStyle w:val="Heading2"/>
+      </w:pPr>
+      <w:r>
+        <w:rPr/>
+        <w:t xml:space="preserve">奖励与交付（不写入见闻录正文）</w:t>
+      </w:r>
+    </w:p>
+    <w:p>
+      <w:pPr>
+        <w:pStyle w:val="Normal"/>
+      </w:pPr>
+      <w:r>
+        <w:rPr/>
+        <w:t xml:space="preserve">开启下一阶段</w:t>
       </w:r>
     </w:p>
     <w:p>
       <w:pPr>
         <w:pStyle w:val="Heading1"/>
       </w:pPr>
-      <w:bookmarkStart w:id="7" w:name="task_007"/>
-      <w:r>
-        <w:rPr/>
-        <w:t xml:space="preserve">任务007 山顶的秘密</w:t>
-      </w:r>
-      <w:bookmarkEnd w:id="7"/>
+      <w:bookmarkStart w:id="8" w:name="task_008"/>
+      <w:r>
+        <w:rPr/>
+        <w:t xml:space="preserve">任务008 冻土上的捉迷藏</w:t>
+      </w:r>
+      <w:bookmarkEnd w:id="8"/>
     </w:p>
     <w:p>
       <w:pPr>
@@ -5951,7 +6256,7 @@
       </w:pPr>
       <w:r>
         <w:rPr/>
-        <w:t xml:space="preserve">补回山顶三只围圈与裂缝触发。到洗翠后才完成本项，不在接取页预告穿越。</w:t>
+        <w:t xml:space="preserve">补回寻找火球鼠、水水獭以及拉苯交还真木木枭。0xBDA/0xBDB分别解锁，顺序不限；假木木枭归下一项。</w:t>
       </w:r>
     </w:p>
     <w:p>
@@ -5960,7 +6265,7 @@
       </w:pPr>
       <w:r>
         <w:rPr/>
-        <w:t xml:space="preserve">共2个条件阶段（可选0个），2页详情。接取0xBCF；完成0xBD0。</w:t>
+        <w:t xml:space="preserve">共4个条件阶段（可选0个），4页详情。接取0xBD1；完成0xBD2。</w:t>
       </w:r>
     </w:p>
     <w:p>
@@ -5978,7 +6283,7 @@
       </w:pPr>
       <w:r>
         <w:rPr/>
-        <w:t xml:space="preserve">阶段1 · 追上伙伴 · 0xBCF</w:t>
+        <w:t xml:space="preserve">阶段1 · 雪中的足迹 · 0xBD1</w:t>
       </w:r>
     </w:p>
     <w:p>
@@ -5994,13 +6299,13 @@
       </w:r>
       <w:r>
         <w:rPr/>
-        <w:t xml:space="preserve">三只宝可梦忽然朝山顶跑去了。</w:t>
-        <w:br/>
-        <w:t xml:space="preserve">主人说那里的磁场很不寻常。</w:t>
-        <w:br/>
-        <w:t xml:space="preserve">我来不及多想。也赶紧追了过去。</w:t>
-        <w:br/>
-        <w:t xml:space="preserve">希望它们别遇上什么危险。</w:t>
+        <w:t xml:space="preserve">醒来以后。三只伙伴又跑散了。</w:t>
+        <w:br/>
+        <w:t xml:space="preserve">这片陌生冻土让我有些不安。</w:t>
+        <w:br/>
+        <w:t xml:space="preserve">我得沿着它们留下的踪迹寻找。</w:t>
+        <w:br/>
+        <w:t xml:space="preserve">尽快把大家重新聚到一起。</w:t>
       </w:r>
     </w:p>
     <w:p>
@@ -6009,7 +6314,7 @@
       </w:pPr>
       <w:r>
         <w:rPr/>
-        <w:t xml:space="preserve">阶段2 · 扭曲的天空 · 0xBD0</w:t>
+        <w:t xml:space="preserve">阶段2 · 微弱的火光 · 0xBDA</w:t>
       </w:r>
     </w:p>
     <w:p>
@@ -6025,13 +6330,75 @@
       </w:r>
       <w:r>
         <w:rPr/>
-        <w:t xml:space="preserve">我在山顶找到了那三个小家伙。</w:t>
-        <w:br/>
-        <w:t xml:space="preserve">可周围的时空突然开始扭曲。</w:t>
-        <w:br/>
-        <w:t xml:space="preserve">再睁开眼时。眼前已是一片冻土。</w:t>
-        <w:br/>
-        <w:t xml:space="preserve">我们究竟来到了什么地方？</w:t>
+        <w:t xml:space="preserve">我找到了用背上火焰取暖的火球鼠。</w:t>
+        <w:br/>
+        <w:t xml:space="preserve">它终于回到了我身边。</w:t>
+        <w:br/>
+        <w:t xml:space="preserve">望着周围的冰雪。</w:t>
+        <w:br/>
+        <w:t xml:space="preserve">我更想快点把伙伴们找齐了。</w:t>
+      </w:r>
+    </w:p>
+    <w:p>
+      <w:pPr>
+        <w:pStyle w:val="Small"/>
+      </w:pPr>
+      <w:r>
+        <w:rPr/>
+        <w:t xml:space="preserve">阶段3 · 雪地里的身影 · 0xBDB</w:t>
+      </w:r>
+    </w:p>
+    <w:p>
+      <w:pPr>
+        <w:pStyle w:val="Dialogue"/>
+      </w:pPr>
+      <w:r>
+        <w:rPr>
+          <w:b/>
+          <w:color w:val="215E66"/>
+        </w:rPr>
+        <w:t xml:space="preserve">我的见闻：</w:t>
+      </w:r>
+      <w:r>
+        <w:rPr/>
+        <w:t xml:space="preserve">水水獭竟在雪地上兴奋地滑行！</w:t>
+        <w:br/>
+        <w:t xml:space="preserve">我总算把这个小家伙找回来了。</w:t>
+        <w:br/>
+        <w:t xml:space="preserve">它一点也不像我这样紧张。</w:t>
+        <w:br/>
+        <w:t xml:space="preserve">有它陪着。这片冻土也亲切了些。</w:t>
+      </w:r>
+    </w:p>
+    <w:p>
+      <w:pPr>
+        <w:pStyle w:val="Small"/>
+      </w:pPr>
+      <w:r>
+        <w:rPr/>
+        <w:t xml:space="preserve">阶段4 · 终于团聚 · 0xBD2</w:t>
+      </w:r>
+    </w:p>
+    <w:p>
+      <w:pPr>
+        <w:pStyle w:val="Dialogue"/>
+      </w:pPr>
+      <w:r>
+        <w:rPr>
+          <w:b/>
+          <w:color w:val="215E66"/>
+        </w:rPr>
+        <w:t xml:space="preserve">我的见闻：</w:t>
+      </w:r>
+      <w:r>
+        <w:rPr/>
+        <w:t xml:space="preserve">拉苯从树洞里找到了真正的木木枭。</w:t>
+        <w:br/>
+        <w:t xml:space="preserve">原来它一直躲在那里瑟瑟发抖。</w:t>
+        <w:br/>
+        <w:t xml:space="preserve">火球鼠。水水獭和它又聚齐了。</w:t>
+        <w:br/>
+        <w:t xml:space="preserve">这一次。可别再跑散了呀。</w:t>
       </w:r>
     </w:p>
     <w:p>
@@ -6049,76 +6416,7 @@
       </w:pPr>
       <w:r>
         <w:rPr/>
-        <w:t xml:space="preserve">追向山顶</w:t>
-      </w:r>
-    </w:p>
-    <w:p>
-      <w:pPr>
-        <w:pStyle w:val="Dialogue"/>
-      </w:pPr>
-      <w:r>
-        <w:rPr>
-          <w:b/>
-          <w:color w:val="215E66"/>
-        </w:rPr>
-        <w:t xml:space="preserve">委托人：</w:t>
-      </w:r>
-      <w:r>
-        <w:rPr/>
-        <w:t xml:space="preserve">难道！？它们要跑到山顶上去吗？</w:t>
-        <w:br/>
-        <w:t xml:space="preserve"/>
-        <w:br/>
-        <w:t xml:space="preserve">上面很危险！那里有强烈的磁场异常啊！</w:t>
-        <w:br/>
-        <w:t xml:space="preserve"/>
-        <w:br/>
-        <w:t xml:space="preserve">〔玩家名〕，快！我们得追上它们！</w:t>
-      </w:r>
-    </w:p>
-    <w:p>
-      <w:pPr>
-        <w:pStyle w:val="Dialogue"/>
-      </w:pPr>
-      <w:r>
-        <w:rPr>
-          <w:b/>
-          <w:color w:val="215E66"/>
-        </w:rPr>
-        <w:t xml:space="preserve">委托人：</w:t>
-      </w:r>
-      <w:r>
-        <w:rPr/>
-        <w:t xml:space="preserve">接受任务:&lt;山顶的秘密&gt;</w:t>
-      </w:r>
-    </w:p>
-    <w:p>
-      <w:pPr>
-        <w:pStyle w:val="Dialogue"/>
-      </w:pPr>
-      <w:r>
-        <w:rPr>
-          <w:b/>
-          <w:color w:val="215E66"/>
-        </w:rPr>
-        <w:t xml:space="preserve">委托人：</w:t>
-      </w:r>
-      <w:r>
-        <w:rPr/>
-        <w:t xml:space="preserve">三只宝可梦已经朝山顶跑去了。</w:t>
-        <w:br/>
-        <w:t xml:space="preserve"/>
-        <w:br/>
-        <w:t xml:space="preserve">赶快去山顶看看吧！</w:t>
-      </w:r>
-    </w:p>
-    <w:p>
-      <w:pPr>
-        <w:pStyle w:val="Heading2"/>
-      </w:pPr>
-      <w:r>
-        <w:rPr/>
-        <w:t xml:space="preserve">山顶：靠近三只伙伴</w:t>
+        <w:t xml:space="preserve">三只宝可梦失散</w:t>
       </w:r>
     </w:p>
     <w:p>
@@ -6134,11 +6432,57 @@
       </w:r>
       <w:r>
         <w:rPr/>
-        <w:t xml:space="preserve">三只宝可梦并排着站在山顶。</w:t>
-        <w:br/>
-        <w:t xml:space="preserve"/>
-        <w:br/>
-        <w:t xml:space="preserve">你准备靠近它们。</w:t>
+        <w:t xml:space="preserve">三只宝可梦跑开了！必须尽快找到它们！</w:t>
+      </w:r>
+    </w:p>
+    <w:p>
+      <w:pPr>
+        <w:pStyle w:val="Dialogue"/>
+      </w:pPr>
+      <w:r>
+        <w:rPr>
+          <w:b/>
+          <w:color w:val="215E66"/>
+        </w:rPr>
+        <w:t xml:space="preserve">旁白：</w:t>
+      </w:r>
+      <w:r>
+        <w:rPr/>
+        <w:t xml:space="preserve">接受任务:&lt;冻土上的捉迷藏&gt;</w:t>
+      </w:r>
+    </w:p>
+    <w:p>
+      <w:pPr>
+        <w:pStyle w:val="Heading2"/>
+      </w:pPr>
+      <w:r>
+        <w:rPr/>
+        <w:t xml:space="preserve">寻找火球鼠与水水獭</w:t>
+      </w:r>
+    </w:p>
+    <w:p>
+      <w:pPr>
+        <w:pStyle w:val="Note"/>
+      </w:pPr>
+      <w:r>
+        <w:rPr/>
+        <w:t xml:space="preserve">两只伙伴可以分别寻找；与拉苯谈到属性三角的对白归入任务010。</w:t>
+      </w:r>
+    </w:p>
+    <w:p>
+      <w:pPr>
+        <w:pStyle w:val="Dialogue"/>
+      </w:pPr>
+      <w:r>
+        <w:rPr>
+          <w:b/>
+          <w:color w:val="215E66"/>
+        </w:rPr>
+        <w:t xml:space="preserve">旁白：</w:t>
+      </w:r>
+      <w:r>
+        <w:rPr/>
+        <w:t xml:space="preserve">火球鼠背上的火焰微弱地燃烧着取暖……</w:t>
       </w:r>
     </w:p>
     <w:p>
@@ -6147,16 +6491,7 @@
       </w:pPr>
       <w:r>
         <w:rPr/>
-        <w:t xml:space="preserve">来源：s:gText_TaskHisui_SummitFoundTrio</w:t>
-      </w:r>
-    </w:p>
-    <w:p>
-      <w:pPr>
-        <w:pStyle w:val="Heading2"/>
-      </w:pPr>
-      <w:r>
-        <w:rPr/>
-        <w:t xml:space="preserve">时空异常</w:t>
+        <w:t xml:space="preserve">来源：s:gText_TaskHisui_CyndaquilFound</w:t>
       </w:r>
     </w:p>
     <w:p>
@@ -6172,20 +6507,16 @@
       </w:r>
       <w:r>
         <w:rPr/>
-        <w:t xml:space="preserve">周围的时空开始扭曲了！</w:t>
-        <w:br/>
-        <w:t xml:space="preserve"/>
-        <w:br/>
-        <w:t xml:space="preserve">〔玩家名〕失去了意识……</w:t>
-      </w:r>
-    </w:p>
-    <w:p>
-      <w:pPr>
-        <w:pStyle w:val="Heading2"/>
-      </w:pPr>
-      <w:r>
-        <w:rPr/>
-        <w:t xml:space="preserve">醒来：陌生的雪原</w:t>
+        <w:t xml:space="preserve">找回了火球鼠！</w:t>
+      </w:r>
+    </w:p>
+    <w:p>
+      <w:pPr>
+        <w:pStyle w:val="Small"/>
+      </w:pPr>
+      <w:r>
+        <w:rPr/>
+        <w:t xml:space="preserve">来源：s:gText_TaskHisui_CyndaquilRecovered</w:t>
       </w:r>
     </w:p>
     <w:p>
@@ -6201,15 +6532,7 @@
       </w:r>
       <w:r>
         <w:rPr/>
-        <w:t xml:space="preserve">你再次醒来。你发现自己躺在</w:t>
-        <w:br/>
-        <w:t xml:space="preserve"/>
-        <w:br/>
-        <w:t xml:space="preserve">一片极其陌生的雪原中。</w:t>
-        <w:br/>
-        <w:t xml:space="preserve"/>
-        <w:br/>
-        <w:t xml:space="preserve">睁开眼，三只宝可梦就在眼前。</w:t>
+        <w:t xml:space="preserve">水水獭竟然在兴奋地滑雪，似乎完全不害怕！</w:t>
       </w:r>
     </w:p>
     <w:p>
@@ -6218,7 +6541,57 @@
       </w:pPr>
       <w:r>
         <w:rPr/>
-        <w:t xml:space="preserve">来源：s:gText_TaskHisui_HisuiWakeNarration</w:t>
+        <w:t xml:space="preserve">来源：s:gText_TaskHisui_OshawottFound</w:t>
+      </w:r>
+    </w:p>
+    <w:p>
+      <w:pPr>
+        <w:pStyle w:val="Dialogue"/>
+      </w:pPr>
+      <w:r>
+        <w:rPr>
+          <w:b/>
+          <w:color w:val="215E66"/>
+        </w:rPr>
+        <w:t xml:space="preserve">旁白：</w:t>
+      </w:r>
+      <w:r>
+        <w:rPr/>
+        <w:t xml:space="preserve">找回了水水獭！</w:t>
+      </w:r>
+    </w:p>
+    <w:p>
+      <w:pPr>
+        <w:pStyle w:val="Small"/>
+      </w:pPr>
+      <w:r>
+        <w:rPr/>
+        <w:t xml:space="preserve">来源：s:gText_TaskHisui_OshawottRecovered</w:t>
+      </w:r>
+    </w:p>
+    <w:p>
+      <w:pPr>
+        <w:pStyle w:val="Heading2"/>
+      </w:pPr>
+      <w:r>
+        <w:rPr/>
+        <w:t xml:space="preserve">寻找木木枭时的异常</w:t>
+      </w:r>
+    </w:p>
+    <w:p>
+      <w:pPr>
+        <w:pStyle w:val="Dialogue"/>
+      </w:pPr>
+      <w:r>
+        <w:rPr>
+          <w:b/>
+          <w:color w:val="215E66"/>
+        </w:rPr>
+        <w:t xml:space="preserve">场景提示：</w:t>
+      </w:r>
+      <w:r>
+        <w:rPr/>
+        <w:t xml:space="preserve">木木枭看上去似乎有点奇怪……</w:t>
       </w:r>
     </w:p>
     <w:p>
@@ -6232,23 +6605,352 @@
     </w:p>
     <w:p>
       <w:pPr>
+        <w:pStyle w:val="Normal"/>
+      </w:pPr>
+      <w:r>
+        <w:rPr/>
+        <w:t xml:space="preserve">开启下一阶段</w:t>
+      </w:r>
+    </w:p>
+    <w:p>
+      <w:pPr>
+        <w:pStyle w:val="Heading1"/>
+      </w:pPr>
+      <w:bookmarkStart w:id="9" w:name="task_009"/>
+      <w:r>
+        <w:rPr/>
+        <w:t xml:space="preserve">任务009 纯白的魅影</w:t>
+      </w:r>
+      <w:bookmarkEnd w:id="9"/>
+    </w:p>
+    <w:p>
+      <w:pPr>
         <w:pStyle w:val="Note"/>
       </w:pPr>
       <w:r>
         <w:rPr/>
-        <w:t xml:space="preserve">本阶段未见独立发奖指令；洗翠篇统一结算见任务011。</w:t>
+        <w:t xml:space="preserve">补回假木木枭显形和洗翠索罗亚克战斗。0xBDC为接近假象，紧接0xBD3接取，不另造一页相同进展。</w:t>
+      </w:r>
+    </w:p>
+    <w:p>
+      <w:pPr>
+        <w:pStyle w:val="Normal"/>
+      </w:pPr>
+      <w:r>
+        <w:rPr/>
+        <w:t xml:space="preserve">共2个条件阶段（可选0个），2页详情。接取0xBD3；完成0xBD4。</w:t>
+      </w:r>
+    </w:p>
+    <w:p>
+      <w:pPr>
+        <w:pStyle w:val="Heading2"/>
+      </w:pPr>
+      <w:r>
+        <w:rPr/>
+        <w:t xml:space="preserve">修订流程与解锁条件</w:t>
+      </w:r>
+    </w:p>
+    <w:p>
+      <w:pPr>
+        <w:pStyle w:val="Small"/>
+      </w:pPr>
+      <w:r>
+        <w:rPr/>
+        <w:t xml:space="preserve">阶段1 · 不对劲的木木枭 · 0xBD3</w:t>
+      </w:r>
+    </w:p>
+    <w:p>
+      <w:pPr>
+        <w:pStyle w:val="Dialogue"/>
+      </w:pPr>
+      <w:r>
+        <w:rPr>
+          <w:b/>
+          <w:color w:val="215E66"/>
+        </w:rPr>
+        <w:t xml:space="preserve">我的见闻：</w:t>
+      </w:r>
+      <w:r>
+        <w:rPr/>
+        <w:t xml:space="preserve">那只木木枭的样子有些不对。</w:t>
+        <w:br/>
+        <w:t xml:space="preserve">我靠近时。眼前的伪装忽然消失。</w:t>
+        <w:br/>
+        <w:t xml:space="preserve">陌生的白色身影挡住了去路。</w:t>
+        <w:br/>
+        <w:t xml:space="preserve">得先保护好身边的伙伴！</w:t>
+      </w:r>
+    </w:p>
+    <w:p>
+      <w:pPr>
+        <w:pStyle w:val="Small"/>
+      </w:pPr>
+      <w:r>
+        <w:rPr/>
+        <w:t xml:space="preserve">阶段2 · 白影消散 · 0xBD4</w:t>
+      </w:r>
+    </w:p>
+    <w:p>
+      <w:pPr>
+        <w:pStyle w:val="Dialogue"/>
+      </w:pPr>
+      <w:r>
+        <w:rPr>
+          <w:b/>
+          <w:color w:val="215E66"/>
+        </w:rPr>
+        <w:t xml:space="preserve">我的见闻：</w:t>
+      </w:r>
+      <w:r>
+        <w:rPr/>
+        <w:t xml:space="preserve">我与那只索罗亚克交战后。</w:t>
+        <w:br/>
+        <w:t xml:space="preserve">它的身影消失在了雪地里。</w:t>
+        <w:br/>
+        <w:t xml:space="preserve">远处的研究员赶来向我搭话。</w:t>
+        <w:br/>
+        <w:t xml:space="preserve">看来。这片冻土并非没有人烟。</w:t>
+      </w:r>
+    </w:p>
+    <w:p>
+      <w:pPr>
+        <w:pStyle w:val="Heading2"/>
+      </w:pPr>
+      <w:r>
+        <w:rPr/>
+        <w:t xml:space="preserve">场景对白与分支</w:t>
+      </w:r>
+    </w:p>
+    <w:p>
+      <w:pPr>
+        <w:pStyle w:val="Heading2"/>
+      </w:pPr>
+      <w:r>
+        <w:rPr/>
+        <w:t xml:space="preserve">假木木枭与洗翠索罗亚克现身</w:t>
+      </w:r>
+    </w:p>
+    <w:p>
+      <w:pPr>
+        <w:pStyle w:val="Dialogue"/>
+      </w:pPr>
+      <w:r>
+        <w:rPr>
+          <w:b/>
+          <w:color w:val="215E66"/>
+        </w:rPr>
+        <w:t xml:space="preserve">旁白：</w:t>
+      </w:r>
+      <w:r>
+        <w:rPr/>
+        <w:t xml:space="preserve">木木枭看上去似乎有点奇怪……</w:t>
+      </w:r>
+    </w:p>
+    <w:p>
+      <w:pPr>
+        <w:pStyle w:val="Small"/>
+      </w:pPr>
+      <w:r>
+        <w:rPr/>
+        <w:t xml:space="preserve">来源：s:gText_TaskHisui_FakeRowletBack</w:t>
+      </w:r>
+    </w:p>
+    <w:p>
+      <w:pPr>
+        <w:pStyle w:val="Dialogue"/>
+      </w:pPr>
+      <w:r>
+        <w:rPr>
+          <w:b/>
+          <w:color w:val="215E66"/>
+        </w:rPr>
+        <w:t xml:space="preserve">旁白：</w:t>
+      </w:r>
+      <w:r>
+        <w:rPr/>
+        <w:t xml:space="preserve">“木木枭”转过头来，可它的眼睛里</w:t>
+        <w:br/>
+        <w:t xml:space="preserve"/>
+        <w:br/>
+        <w:t xml:space="preserve">却泛着诡异的红光！</w:t>
+        <w:br/>
+        <w:t xml:space="preserve"/>
+        <w:br/>
+        <w:t xml:space="preserve">它发出了完全不属于木木枭的凄厉尖啸！</w:t>
+        <w:br/>
+        <w:t xml:space="preserve"/>
+        <w:br/>
+        <w:t xml:space="preserve">那道身影猛地扭曲、拉长，白色的毛发疯狂生长。</w:t>
+        <w:br/>
+        <w:t xml:space="preserve"/>
+        <w:br/>
+        <w:t xml:space="preserve">赤红的怨念如火焰升腾。它显出了真正的姿态……</w:t>
+        <w:br/>
+        <w:t xml:space="preserve"/>
+        <w:br/>
+        <w:t xml:space="preserve">那是一只巨大的、充满攻击性的</w:t>
+        <w:br/>
+        <w:t xml:space="preserve"/>
+        <w:br/>
+        <w:t xml:space="preserve">洗翠索罗亚克！</w:t>
+      </w:r>
+    </w:p>
+    <w:p>
+      <w:pPr>
+        <w:pStyle w:val="Small"/>
+      </w:pPr>
+      <w:r>
+        <w:rPr/>
+        <w:t xml:space="preserve">来源：s:gText_TaskHisui_ZoroarkReveal</w:t>
+      </w:r>
+    </w:p>
+    <w:p>
+      <w:pPr>
+        <w:pStyle w:val="Heading2"/>
+      </w:pPr>
+      <w:r>
+        <w:rPr/>
+        <w:t xml:space="preserve">索罗亚克消失</w:t>
+      </w:r>
+    </w:p>
+    <w:p>
+      <w:pPr>
+        <w:pStyle w:val="Dialogue"/>
+      </w:pPr>
+      <w:r>
+        <w:rPr>
+          <w:b/>
+          <w:color w:val="215E66"/>
+        </w:rPr>
+        <w:t xml:space="preserve">旁白：</w:t>
+      </w:r>
+      <w:r>
+        <w:rPr/>
+        <w:t xml:space="preserve">索罗亚克消失了……</w:t>
+      </w:r>
+    </w:p>
+    <w:p>
+      <w:pPr>
+        <w:pStyle w:val="Dialogue"/>
+      </w:pPr>
+      <w:r>
+        <w:rPr>
+          <w:b/>
+          <w:color w:val="215E66"/>
+        </w:rPr>
+        <w:t xml:space="preserve">旁白：</w:t>
+      </w:r>
+      <w:r>
+        <w:rPr/>
+        <w:t xml:space="preserve">完成任务:&lt;纯白的魅影&gt;</w:t>
+      </w:r>
+    </w:p>
+    <w:p>
+      <w:pPr>
+        <w:pStyle w:val="Heading2"/>
+      </w:pPr>
+      <w:r>
+        <w:rPr/>
+        <w:t xml:space="preserve">陌生人的惊叹</w:t>
+      </w:r>
+    </w:p>
+    <w:p>
+      <w:pPr>
+        <w:pStyle w:val="Dialogue"/>
+      </w:pPr>
+      <w:r>
+        <w:rPr>
+          <w:b/>
+          <w:color w:val="215E66"/>
+        </w:rPr>
+        <w:t xml:space="preserve">陌生研究员（拉苯）：</w:t>
+      </w:r>
+      <w:r>
+        <w:rPr/>
+        <w:t xml:space="preserve">哎呀呀！真是太惊险了！</w:t>
+        <w:br/>
+        <w:t xml:space="preserve"/>
+        <w:br/>
+        <w:t xml:space="preserve">我都为你捏了一把冷汗啊，年轻的陌生人！</w:t>
+      </w:r>
+    </w:p>
+    <w:p>
+      <w:pPr>
+        <w:pStyle w:val="Heading2"/>
+      </w:pPr>
+      <w:r>
+        <w:rPr/>
+        <w:t xml:space="preserve">找回木木枭</w:t>
+      </w:r>
+    </w:p>
+    <w:p>
+      <w:pPr>
+        <w:pStyle w:val="Dialogue"/>
+      </w:pPr>
+      <w:r>
+        <w:rPr>
+          <w:b/>
+          <w:color w:val="215E66"/>
+        </w:rPr>
+        <w:t xml:space="preserve">拉苯博士：</w:t>
+      </w:r>
+      <w:r>
+        <w:rPr/>
+        <w:t xml:space="preserve">我刚才正在远处观察这片冻土的生态，</w:t>
+        <w:br/>
+        <w:t xml:space="preserve"/>
+        <w:br/>
+        <w:t xml:space="preserve">结果就看见你和那只可怕的索罗亚克战斗！</w:t>
+        <w:br/>
+        <w:t xml:space="preserve"/>
+        <w:br/>
+        <w:t xml:space="preserve">要知道，宝可梦可是非常、非常可怕的生物啊！</w:t>
+        <w:br/>
+        <w:t xml:space="preserve"/>
+        <w:br/>
+        <w:t xml:space="preserve">你竟然能指挥它们作战？对了，刚才这只木木枭</w:t>
+        <w:br/>
+        <w:t xml:space="preserve"/>
+        <w:br/>
+        <w:t xml:space="preserve">一直躲在树洞里瑟瑟发抖……</w:t>
+        <w:br/>
+        <w:t xml:space="preserve"/>
+        <w:br/>
+        <w:t xml:space="preserve">我看它望着你的方向，它是你的宝可梦吗？</w:t>
+        <w:br/>
+        <w:t xml:space="preserve"/>
+        <w:br/>
+        <w:t xml:space="preserve">来，快回到你主人的身边吧。</w:t>
+      </w:r>
+    </w:p>
+    <w:p>
+      <w:pPr>
+        <w:pStyle w:val="Heading2"/>
+      </w:pPr>
+      <w:r>
+        <w:rPr/>
+        <w:t xml:space="preserve">奖励与交付（不写入见闻录正文）</w:t>
+      </w:r>
+    </w:p>
+    <w:p>
+      <w:pPr>
+        <w:pStyle w:val="Normal"/>
+      </w:pPr>
+      <w:r>
+        <w:rPr/>
+        <w:t xml:space="preserve">开启下一阶段</w:t>
       </w:r>
     </w:p>
     <w:p>
       <w:pPr>
         <w:pStyle w:val="Heading1"/>
       </w:pPr>
-      <w:bookmarkStart w:id="8" w:name="task_008"/>
-      <w:r>
-        <w:rPr/>
-        <w:t xml:space="preserve">任务008 冻土上的捉迷藏</w:t>
-      </w:r>
-      <w:bookmarkEnd w:id="8"/>
+      <w:bookmarkStart w:id="10" w:name="task_010"/>
+      <w:r>
+        <w:rPr/>
+        <w:t xml:space="preserve">任务010 在未知的土地上</w:t>
+      </w:r>
+      <w:bookmarkEnd w:id="10"/>
     </w:p>
     <w:p>
       <w:pPr>
@@ -6256,7 +6958,7 @@
       </w:pPr>
       <w:r>
         <w:rPr/>
-        <w:t xml:space="preserve">补回寻找火球鼠、水水獭以及拉苯交还真木木枭。0xBDA/0xBDB分别解锁，顺序不限；假木木枭归下一项。</w:t>
+        <w:t xml:space="preserve">与索罗亚克战后连续播放。0xBD5接取、0xBD6告别；拉苯的理想不提前放进刚认识他的页面。</w:t>
       </w:r>
     </w:p>
     <w:p>
@@ -6265,7 +6967,7 @@
       </w:pPr>
       <w:r>
         <w:rPr/>
-        <w:t xml:space="preserve">共4个条件阶段（可选0个），4页详情。接取0xBD1；完成0xBD2。</w:t>
+        <w:t xml:space="preserve">共2个条件阶段（可选0个），2页详情。接取0xBD5；完成0xBD6。</w:t>
       </w:r>
     </w:p>
     <w:p>
@@ -6283,7 +6985,7 @@
       </w:pPr>
       <w:r>
         <w:rPr/>
-        <w:t xml:space="preserve">阶段1 · 雪中的足迹 · 0xBD1</w:t>
+        <w:t xml:space="preserve">阶段1 · 陌生的研究员 · 0xBD5</w:t>
       </w:r>
     </w:p>
     <w:p>
@@ -6299,13 +7001,13 @@
       </w:r>
       <w:r>
         <w:rPr/>
-        <w:t xml:space="preserve">醒来以后。三只伙伴又跑散了。</w:t>
-        <w:br/>
-        <w:t xml:space="preserve">这片陌生冻土让我有些不安。</w:t>
-        <w:br/>
-        <w:t xml:space="preserve">我得沿着它们留下的踪迹寻找。</w:t>
-        <w:br/>
-        <w:t xml:space="preserve">尽快把大家重新聚到一起。</w:t>
+        <w:t xml:space="preserve">赶来的研究员说。他叫拉苯。</w:t>
+        <w:br/>
+        <w:t xml:space="preserve">这里竟是名为洗翠的地方。</w:t>
+        <w:br/>
+        <w:t xml:space="preserve">他对我能指挥宝可梦十分惊讶。</w:t>
+        <w:br/>
+        <w:t xml:space="preserve">我想听听他眼中的这个世界。</w:t>
       </w:r>
     </w:p>
     <w:p>
@@ -6314,7 +7016,7 @@
       </w:pPr>
       <w:r>
         <w:rPr/>
-        <w:t xml:space="preserve">阶段2 · 微弱的火光 · 0xBDA</w:t>
+        <w:t xml:space="preserve">阶段2 · 没有停下的笔 · 0xBD6</w:t>
       </w:r>
     </w:p>
     <w:p>
@@ -6330,75 +7032,13 @@
       </w:r>
       <w:r>
         <w:rPr/>
-        <w:t xml:space="preserve">我找到了用背上火焰取暖的火球鼠。</w:t>
-        <w:br/>
-        <w:t xml:space="preserve">它终于回到了我身边。</w:t>
-        <w:br/>
-        <w:t xml:space="preserve">望着周围的冰雪。</w:t>
-        <w:br/>
-        <w:t xml:space="preserve">我更想快点把伙伴们找齐了。</w:t>
-      </w:r>
-    </w:p>
-    <w:p>
-      <w:pPr>
-        <w:pStyle w:val="Small"/>
-      </w:pPr>
-      <w:r>
-        <w:rPr/>
-        <w:t xml:space="preserve">阶段3 · 雪地里的身影 · 0xBDB</w:t>
-      </w:r>
-    </w:p>
-    <w:p>
-      <w:pPr>
-        <w:pStyle w:val="Dialogue"/>
-      </w:pPr>
-      <w:r>
-        <w:rPr>
-          <w:b/>
-          <w:color w:val="215E66"/>
-        </w:rPr>
-        <w:t xml:space="preserve">我的见闻：</w:t>
-      </w:r>
-      <w:r>
-        <w:rPr/>
-        <w:t xml:space="preserve">水水獭竟在雪地上兴奋地滑行！</w:t>
-        <w:br/>
-        <w:t xml:space="preserve">我总算把这个小家伙找回来了。</w:t>
-        <w:br/>
-        <w:t xml:space="preserve">它一点也不像我这样紧张。</w:t>
-        <w:br/>
-        <w:t xml:space="preserve">有它陪着。这片冻土也亲切了些。</w:t>
-      </w:r>
-    </w:p>
-    <w:p>
-      <w:pPr>
-        <w:pStyle w:val="Small"/>
-      </w:pPr>
-      <w:r>
-        <w:rPr/>
-        <w:t xml:space="preserve">阶段4 · 终于团聚 · 0xBD2</w:t>
-      </w:r>
-    </w:p>
-    <w:p>
-      <w:pPr>
-        <w:pStyle w:val="Dialogue"/>
-      </w:pPr>
-      <w:r>
-        <w:rPr>
-          <w:b/>
-          <w:color w:val="215E66"/>
-        </w:rPr>
-        <w:t xml:space="preserve">我的见闻：</w:t>
-      </w:r>
-      <w:r>
-        <w:rPr/>
-        <w:t xml:space="preserve">拉苯从树洞里找到了真正的木木枭。</w:t>
-        <w:br/>
-        <w:t xml:space="preserve">原来它一直躲在那里瑟瑟发抖。</w:t>
-        <w:br/>
-        <w:t xml:space="preserve">火球鼠。水水獭和它又聚齐了。</w:t>
-        <w:br/>
-        <w:t xml:space="preserve">这一次。可别再跑散了呀。</w:t>
+        <w:t xml:space="preserve">拉苯想把所有宝可梦记录进图鉴。</w:t>
+        <w:br/>
+        <w:t xml:space="preserve">即使旁人不理解。他也不会放弃。</w:t>
+        <w:br/>
+        <w:t xml:space="preserve">分别时。他托我去看看未来。</w:t>
+        <w:br/>
+        <w:t xml:space="preserve">这份愿望。我一定会记住。</w:t>
       </w:r>
     </w:p>
     <w:p>
@@ -6416,182 +7056,298 @@
       </w:pPr>
       <w:r>
         <w:rPr/>
-        <w:t xml:space="preserve">三只宝可梦失散</w:t>
-      </w:r>
-    </w:p>
-    <w:p>
-      <w:pPr>
-        <w:pStyle w:val="Dialogue"/>
-      </w:pPr>
-      <w:r>
-        <w:rPr>
-          <w:b/>
-          <w:color w:val="215E66"/>
-        </w:rPr>
-        <w:t xml:space="preserve">旁白：</w:t>
-      </w:r>
-      <w:r>
-        <w:rPr/>
-        <w:t xml:space="preserve">三只宝可梦跑开了！必须尽快找到它们！</w:t>
-      </w:r>
-    </w:p>
-    <w:p>
-      <w:pPr>
-        <w:pStyle w:val="Dialogue"/>
-      </w:pPr>
-      <w:r>
-        <w:rPr>
-          <w:b/>
-          <w:color w:val="215E66"/>
-        </w:rPr>
-        <w:t xml:space="preserve">旁白：</w:t>
-      </w:r>
-      <w:r>
-        <w:rPr/>
-        <w:t xml:space="preserve">接受任务:&lt;冻土上的捉迷藏&gt;</w:t>
-      </w:r>
-    </w:p>
-    <w:p>
-      <w:pPr>
-        <w:pStyle w:val="Heading2"/>
-      </w:pPr>
-      <w:r>
-        <w:rPr/>
-        <w:t xml:space="preserve">寻找火球鼠与水水獭</w:t>
-      </w:r>
-    </w:p>
-    <w:p>
-      <w:pPr>
-        <w:pStyle w:val="Note"/>
-      </w:pPr>
-      <w:r>
-        <w:rPr/>
-        <w:t xml:space="preserve">两只伙伴可以分别寻找；与拉苯谈到属性三角的对白归入任务010。</w:t>
-      </w:r>
-    </w:p>
-    <w:p>
-      <w:pPr>
-        <w:pStyle w:val="Dialogue"/>
-      </w:pPr>
-      <w:r>
-        <w:rPr>
-          <w:b/>
-          <w:color w:val="215E66"/>
-        </w:rPr>
-        <w:t xml:space="preserve">旁白：</w:t>
-      </w:r>
-      <w:r>
-        <w:rPr/>
-        <w:t xml:space="preserve">火球鼠背上的火焰微弱地燃烧着取暖……</w:t>
-      </w:r>
-    </w:p>
-    <w:p>
-      <w:pPr>
-        <w:pStyle w:val="Small"/>
-      </w:pPr>
-      <w:r>
-        <w:rPr/>
-        <w:t xml:space="preserve">来源：s:gText_TaskHisui_CyndaquilFound</w:t>
-      </w:r>
-    </w:p>
-    <w:p>
-      <w:pPr>
-        <w:pStyle w:val="Dialogue"/>
-      </w:pPr>
-      <w:r>
-        <w:rPr>
-          <w:b/>
-          <w:color w:val="215E66"/>
-        </w:rPr>
-        <w:t xml:space="preserve">旁白：</w:t>
-      </w:r>
-      <w:r>
-        <w:rPr/>
-        <w:t xml:space="preserve">找回了火球鼠！</w:t>
-      </w:r>
-    </w:p>
-    <w:p>
-      <w:pPr>
-        <w:pStyle w:val="Small"/>
-      </w:pPr>
-      <w:r>
-        <w:rPr/>
-        <w:t xml:space="preserve">来源：s:gText_TaskHisui_CyndaquilRecovered</w:t>
-      </w:r>
-    </w:p>
-    <w:p>
-      <w:pPr>
-        <w:pStyle w:val="Dialogue"/>
-      </w:pPr>
-      <w:r>
-        <w:rPr>
-          <w:b/>
-          <w:color w:val="215E66"/>
-        </w:rPr>
-        <w:t xml:space="preserve">旁白：</w:t>
-      </w:r>
-      <w:r>
-        <w:rPr/>
-        <w:t xml:space="preserve">水水獭竟然在兴奋地滑雪，似乎完全不害怕！</w:t>
-      </w:r>
-    </w:p>
-    <w:p>
-      <w:pPr>
-        <w:pStyle w:val="Small"/>
-      </w:pPr>
-      <w:r>
-        <w:rPr/>
-        <w:t xml:space="preserve">来源：s:gText_TaskHisui_OshawottFound</w:t>
-      </w:r>
-    </w:p>
-    <w:p>
-      <w:pPr>
-        <w:pStyle w:val="Dialogue"/>
-      </w:pPr>
-      <w:r>
-        <w:rPr>
-          <w:b/>
-          <w:color w:val="215E66"/>
-        </w:rPr>
-        <w:t xml:space="preserve">旁白：</w:t>
-      </w:r>
-      <w:r>
-        <w:rPr/>
-        <w:t xml:space="preserve">找回了水水獭！</w:t>
-      </w:r>
-    </w:p>
-    <w:p>
-      <w:pPr>
-        <w:pStyle w:val="Small"/>
-      </w:pPr>
-      <w:r>
-        <w:rPr/>
-        <w:t xml:space="preserve">来源：s:gText_TaskHisui_OshawottRecovered</w:t>
-      </w:r>
-    </w:p>
-    <w:p>
-      <w:pPr>
-        <w:pStyle w:val="Heading2"/>
-      </w:pPr>
-      <w:r>
-        <w:rPr/>
-        <w:t xml:space="preserve">寻找木木枭时的异常</w:t>
-      </w:r>
-    </w:p>
-    <w:p>
-      <w:pPr>
-        <w:pStyle w:val="Dialogue"/>
-      </w:pPr>
-      <w:r>
-        <w:rPr>
-          <w:b/>
-          <w:color w:val="215E66"/>
-        </w:rPr>
-        <w:t xml:space="preserve">场景提示：</w:t>
-      </w:r>
-      <w:r>
-        <w:rPr/>
-        <w:t xml:space="preserve">木木枭看上去似乎有点奇怪……</w:t>
+        <w:t xml:space="preserve">拉苯自我介绍</w:t>
+      </w:r>
+    </w:p>
+    <w:p>
+      <w:pPr>
+        <w:pStyle w:val="Dialogue"/>
+      </w:pPr>
+      <w:r>
+        <w:rPr>
+          <w:b/>
+          <w:color w:val="215E66"/>
+        </w:rPr>
+        <w:t xml:space="preserve">拉苯博士：</w:t>
+      </w:r>
+      <w:r>
+        <w:rPr/>
+        <w:t xml:space="preserve">噢，请原谅我的失礼。我还没自我介绍。</w:t>
+        <w:br/>
+        <w:t xml:space="preserve"/>
+        <w:br/>
+        <w:t xml:space="preserve">我是拉苯，是洗翠地区的</w:t>
+        <w:br/>
+        <w:t xml:space="preserve"/>
+        <w:br/>
+        <w:t xml:space="preserve">宝可梦研究员。</w:t>
+      </w:r>
+    </w:p>
+    <w:p>
+      <w:pPr>
+        <w:pStyle w:val="Heading2"/>
+      </w:pPr>
+      <w:r>
+        <w:rPr/>
+        <w:t xml:space="preserve">三只伙伴带来的启发</w:t>
+      </w:r>
+    </w:p>
+    <w:p>
+      <w:pPr>
+        <w:pStyle w:val="Dialogue"/>
+      </w:pPr>
+      <w:r>
+        <w:rPr>
+          <w:b/>
+          <w:color w:val="215E66"/>
+        </w:rPr>
+        <w:t xml:space="preserve">拉苯博士：</w:t>
+      </w:r>
+      <w:r>
+        <w:rPr/>
+        <w:t xml:space="preserve">哦哦哦！等等！你身边跟着的</w:t>
+        <w:br/>
+        <w:t xml:space="preserve"/>
+        <w:br/>
+        <w:t xml:space="preserve">那两个小家伙是……</w:t>
+        <w:br/>
+        <w:t xml:space="preserve"/>
+        <w:br/>
+        <w:t xml:space="preserve">火球鼠，还有水水獭？！这真是不可思议！</w:t>
+        <w:br/>
+        <w:t xml:space="preserve"/>
+        <w:br/>
+        <w:t xml:space="preserve">火球鼠、水水獭、木木枭……草克制水，水克制火，</w:t>
+        <w:br/>
+        <w:t xml:space="preserve"/>
+        <w:br/>
+        <w:t xml:space="preserve">火又克制草！</w:t>
+        <w:br/>
+        <w:t xml:space="preserve"/>
+        <w:br/>
+        <w:t xml:space="preserve">这三只宝可梦构成了完美又和谐的</w:t>
+        <w:br/>
+        <w:t xml:space="preserve"/>
+        <w:br/>
+        <w:t xml:space="preserve">属性三角关系啊！</w:t>
+        <w:br/>
+        <w:t xml:space="preserve"/>
+        <w:br/>
+        <w:t xml:space="preserve">原来如此……我懂了！</w:t>
+        <w:br/>
+        <w:t xml:space="preserve"/>
+        <w:br/>
+        <w:t xml:space="preserve">这是一个绝妙的启发！我最近正发愁，</w:t>
+        <w:br/>
+        <w:t xml:space="preserve"/>
+        <w:br/>
+        <w:t xml:space="preserve">该挑什么宝可梦来引导新人调查队员。</w:t>
+        <w:br/>
+        <w:t xml:space="preserve"/>
+        <w:br/>
+        <w:t xml:space="preserve">如果把这三只彼此制衡、</w:t>
+        <w:br/>
+        <w:t xml:space="preserve"/>
+        <w:br/>
+        <w:t xml:space="preserve">又能够和谐相处的宝可梦，作为初学者的初始搭档……</w:t>
+        <w:br/>
+        <w:t xml:space="preserve"/>
+        <w:br/>
+        <w:t xml:space="preserve">也许能大大减轻人们接触宝可梦时的恐惧呢！</w:t>
+        <w:br/>
+        <w:t xml:space="preserve"/>
+        <w:br/>
+        <w:t xml:space="preserve">看到它们对你如此依恋的样子，</w:t>
+        <w:br/>
+        <w:t xml:space="preserve"/>
+        <w:br/>
+        <w:t xml:space="preserve">真是让人感慨万千……</w:t>
+      </w:r>
+    </w:p>
+    <w:p>
+      <w:pPr>
+        <w:pStyle w:val="Heading2"/>
+      </w:pPr>
+      <w:r>
+        <w:rPr/>
+        <w:t xml:space="preserve">关于人与宝可梦的未来</w:t>
+      </w:r>
+    </w:p>
+    <w:p>
+      <w:pPr>
+        <w:pStyle w:val="Dialogue"/>
+      </w:pPr>
+      <w:r>
+        <w:rPr>
+          <w:b/>
+          <w:color w:val="215E66"/>
+        </w:rPr>
+        <w:t xml:space="preserve">拉苯博士：</w:t>
+      </w:r>
+      <w:r>
+        <w:rPr/>
+        <w:t xml:space="preserve">你知道吗？在这个洗翠地区，人们对宝可梦充满恐惧。</w:t>
+        <w:br/>
+        <w:t xml:space="preserve"/>
+        <w:br/>
+        <w:t xml:space="preserve">大家把它们当成会伤人的野兽，</w:t>
+        <w:br/>
+        <w:t xml:space="preserve"/>
+        <w:br/>
+        <w:t xml:space="preserve">当成不可理喻的怪物。</w:t>
+        <w:br/>
+        <w:t xml:space="preserve"/>
+        <w:br/>
+        <w:t xml:space="preserve">甚至连银河队的马加木老大，</w:t>
+        <w:br/>
+        <w:t xml:space="preserve"/>
+        <w:br/>
+        <w:t xml:space="preserve">也总是斥责我。</w:t>
+        <w:br/>
+        <w:t xml:space="preserve"/>
+        <w:br/>
+        <w:t xml:space="preserve">在他眼里，我每天去观察、记录这些生物的生态，</w:t>
+        <w:br/>
+        <w:t xml:space="preserve"/>
+        <w:br/>
+        <w:t xml:space="preserve">不过是毫无用处的过家家行为。</w:t>
+        <w:br/>
+        <w:t xml:space="preserve"/>
+        <w:br/>
+        <w:t xml:space="preserve">不去斩除危险，反而去研究危险，</w:t>
+        <w:br/>
+        <w:t xml:space="preserve"/>
+        <w:br/>
+        <w:t xml:space="preserve">简直是愚不可及。</w:t>
+        <w:br/>
+        <w:t xml:space="preserve"/>
+        <w:br/>
+        <w:t xml:space="preserve">但是……我有一个梦想！我要把所有宝可梦的生态</w:t>
+        <w:br/>
+        <w:t xml:space="preserve"/>
+        <w:br/>
+        <w:t xml:space="preserve">都记录下来，</w:t>
+        <w:br/>
+        <w:t xml:space="preserve"/>
+        <w:br/>
+        <w:t xml:space="preserve">我要编纂出这个世界上第一本宝可梦图鉴！</w:t>
+        <w:br/>
+        <w:t xml:space="preserve"/>
+        <w:br/>
+        <w:t xml:space="preserve">因为恐惧往往来源于未知。只要人们了解它们的习性，</w:t>
+        <w:br/>
+        <w:t xml:space="preserve"/>
+        <w:br/>
+        <w:t xml:space="preserve">知道它们也会像这样互相依靠……</w:t>
+        <w:br/>
+        <w:t xml:space="preserve"/>
+        <w:br/>
+        <w:t xml:space="preserve">恐惧就会变成好奇，好奇就会变成理解！</w:t>
+        <w:br/>
+        <w:t xml:space="preserve"/>
+        <w:br/>
+        <w:t xml:space="preserve">哪怕马加木老大不认可我，哪怕我注定是个怪人，</w:t>
+        <w:br/>
+        <w:t xml:space="preserve"/>
+        <w:br/>
+        <w:t xml:space="preserve">一个不被理解的怪人，我也绝不会停下记录的笔！</w:t>
+        <w:br/>
+        <w:t xml:space="preserve"/>
+        <w:br/>
+        <w:t xml:space="preserve">我相信，这份记录会像种子一样</w:t>
+        <w:br/>
+        <w:t xml:space="preserve"/>
+        <w:br/>
+        <w:t xml:space="preserve">在时光里流传下去。</w:t>
+        <w:br/>
+        <w:t xml:space="preserve"/>
+        <w:br/>
+        <w:t xml:space="preserve">也许要等上一百年，甚至几百年……</w:t>
+        <w:br/>
+        <w:t xml:space="preserve"/>
+        <w:br/>
+        <w:t xml:space="preserve">但我坚信，在遥远的未来，人类一定能和这些奇妙生物</w:t>
+        <w:br/>
+        <w:t xml:space="preserve"/>
+        <w:br/>
+        <w:t xml:space="preserve">消除隔阂，成为并肩同行的伙伴！</w:t>
+      </w:r>
+    </w:p>
+    <w:p>
+      <w:pPr>
+        <w:pStyle w:val="Dialogue"/>
+      </w:pPr>
+      <w:r>
+        <w:rPr>
+          <w:b/>
+          <w:color w:val="215E66"/>
+        </w:rPr>
+        <w:t xml:space="preserve">拉苯博士：</w:t>
+      </w:r>
+      <w:r>
+        <w:rPr/>
+        <w:t xml:space="preserve">拥有这种平衡力量的你，简直是天生的调查队员！</w:t>
+        <w:br/>
+        <w:t xml:space="preserve"/>
+        <w:br/>
+        <w:t xml:space="preserve">如果可以的话，真希望你能加入我们，</w:t>
+        <w:br/>
+        <w:t xml:space="preserve"/>
+        <w:br/>
+        <w:t xml:space="preserve">一起来见证那个未来的开端啊！</w:t>
+      </w:r>
+    </w:p>
+    <w:p>
+      <w:pPr>
+        <w:pStyle w:val="Heading2"/>
+      </w:pPr>
+      <w:r>
+        <w:rPr/>
+        <w:t xml:space="preserve">时空分离时的告别</w:t>
+      </w:r>
+    </w:p>
+    <w:p>
+      <w:pPr>
+        <w:pStyle w:val="Dialogue"/>
+      </w:pPr>
+      <w:r>
+        <w:rPr>
+          <w:b/>
+          <w:color w:val="215E66"/>
+        </w:rPr>
+        <w:t xml:space="preserve">拉苯博士：</w:t>
+      </w:r>
+      <w:r>
+        <w:rPr/>
+        <w:t xml:space="preserve">消失了吗！？</w:t>
+        <w:br/>
+        <w:t xml:space="preserve"/>
+        <w:br/>
+        <w:t xml:space="preserve">看来，洗翠地区并不是你该留下的地方。</w:t>
+        <w:br/>
+        <w:t xml:space="preserve"/>
+        <w:br/>
+        <w:t xml:space="preserve">虽然只是短短一会儿，但很高兴认识你。</w:t>
+        <w:br/>
+        <w:t xml:space="preserve"/>
+        <w:br/>
+        <w:t xml:space="preserve">请替我去看看那个……你所在的未来吧……！</w:t>
+      </w:r>
+    </w:p>
+    <w:p>
+      <w:pPr>
+        <w:pStyle w:val="Dialogue"/>
+      </w:pPr>
+      <w:r>
+        <w:rPr>
+          <w:b/>
+          <w:color w:val="215E66"/>
+        </w:rPr>
+        <w:t xml:space="preserve">拉苯博士：</w:t>
+      </w:r>
+      <w:r>
+        <w:rPr/>
+        <w:t xml:space="preserve">完成任务:&lt;在未知的土地上&gt;</w:t>
       </w:r>
     </w:p>
     <w:p>
@@ -6605,767 +7361,11 @@
     </w:p>
     <w:p>
       <w:pPr>
-        <w:pStyle w:val="Note"/>
-      </w:pPr>
-      <w:r>
-        <w:rPr/>
-        <w:t xml:space="preserve">本阶段未见独立发奖指令；洗翠篇统一结算见任务011。</w:t>
-      </w:r>
-    </w:p>
-    <w:p>
-      <w:pPr>
-        <w:pStyle w:val="Heading1"/>
-      </w:pPr>
-      <w:bookmarkStart w:id="9" w:name="task_009"/>
-      <w:r>
-        <w:rPr/>
-        <w:t xml:space="preserve">任务009 纯白的魅影</w:t>
-      </w:r>
-      <w:bookmarkEnd w:id="9"/>
-    </w:p>
-    <w:p>
-      <w:pPr>
-        <w:pStyle w:val="Note"/>
-      </w:pPr>
-      <w:r>
-        <w:rPr/>
-        <w:t xml:space="preserve">补回假木木枭显形和洗翠索罗亚克战斗。0xBDC为接近假象，紧接0xBD3接取，不另造一页相同进展。</w:t>
-      </w:r>
-    </w:p>
-    <w:p>
-      <w:pPr>
         <w:pStyle w:val="Normal"/>
       </w:pPr>
       <w:r>
         <w:rPr/>
-        <w:t xml:space="preserve">共2个条件阶段（可选0个），2页详情。接取0xBD3；完成0xBD4。</w:t>
-      </w:r>
-    </w:p>
-    <w:p>
-      <w:pPr>
-        <w:pStyle w:val="Heading2"/>
-      </w:pPr>
-      <w:r>
-        <w:rPr/>
-        <w:t xml:space="preserve">修订流程与解锁条件</w:t>
-      </w:r>
-    </w:p>
-    <w:p>
-      <w:pPr>
-        <w:pStyle w:val="Small"/>
-      </w:pPr>
-      <w:r>
-        <w:rPr/>
-        <w:t xml:space="preserve">阶段1 · 不对劲的木木枭 · 0xBD3</w:t>
-      </w:r>
-    </w:p>
-    <w:p>
-      <w:pPr>
-        <w:pStyle w:val="Dialogue"/>
-      </w:pPr>
-      <w:r>
-        <w:rPr>
-          <w:b/>
-          <w:color w:val="215E66"/>
-        </w:rPr>
-        <w:t xml:space="preserve">我的见闻：</w:t>
-      </w:r>
-      <w:r>
-        <w:rPr/>
-        <w:t xml:space="preserve">那只木木枭的样子有些不对。</w:t>
-        <w:br/>
-        <w:t xml:space="preserve">我靠近时。眼前的伪装忽然消失。</w:t>
-        <w:br/>
-        <w:t xml:space="preserve">陌生的白色身影挡住了去路。</w:t>
-        <w:br/>
-        <w:t xml:space="preserve">得先保护好身边的伙伴！</w:t>
-      </w:r>
-    </w:p>
-    <w:p>
-      <w:pPr>
-        <w:pStyle w:val="Small"/>
-      </w:pPr>
-      <w:r>
-        <w:rPr/>
-        <w:t xml:space="preserve">阶段2 · 白影消散 · 0xBD4</w:t>
-      </w:r>
-    </w:p>
-    <w:p>
-      <w:pPr>
-        <w:pStyle w:val="Dialogue"/>
-      </w:pPr>
-      <w:r>
-        <w:rPr>
-          <w:b/>
-          <w:color w:val="215E66"/>
-        </w:rPr>
-        <w:t xml:space="preserve">我的见闻：</w:t>
-      </w:r>
-      <w:r>
-        <w:rPr/>
-        <w:t xml:space="preserve">我与那只索罗亚克交战后。</w:t>
-        <w:br/>
-        <w:t xml:space="preserve">它的身影消失在了雪地里。</w:t>
-        <w:br/>
-        <w:t xml:space="preserve">远处的研究员赶来向我搭话。</w:t>
-        <w:br/>
-        <w:t xml:space="preserve">看来。这片冻土并非没有人烟。</w:t>
-      </w:r>
-    </w:p>
-    <w:p>
-      <w:pPr>
-        <w:pStyle w:val="Heading2"/>
-      </w:pPr>
-      <w:r>
-        <w:rPr/>
-        <w:t xml:space="preserve">场景对白与分支</w:t>
-      </w:r>
-    </w:p>
-    <w:p>
-      <w:pPr>
-        <w:pStyle w:val="Heading2"/>
-      </w:pPr>
-      <w:r>
-        <w:rPr/>
-        <w:t xml:space="preserve">假木木枭与洗翠索罗亚克现身</w:t>
-      </w:r>
-    </w:p>
-    <w:p>
-      <w:pPr>
-        <w:pStyle w:val="Dialogue"/>
-      </w:pPr>
-      <w:r>
-        <w:rPr>
-          <w:b/>
-          <w:color w:val="215E66"/>
-        </w:rPr>
-        <w:t xml:space="preserve">旁白：</w:t>
-      </w:r>
-      <w:r>
-        <w:rPr/>
-        <w:t xml:space="preserve">木木枭看上去似乎有点奇怪……</w:t>
-      </w:r>
-    </w:p>
-    <w:p>
-      <w:pPr>
-        <w:pStyle w:val="Small"/>
-      </w:pPr>
-      <w:r>
-        <w:rPr/>
-        <w:t xml:space="preserve">来源：s:gText_TaskHisui_FakeRowletBack</w:t>
-      </w:r>
-    </w:p>
-    <w:p>
-      <w:pPr>
-        <w:pStyle w:val="Dialogue"/>
-      </w:pPr>
-      <w:r>
-        <w:rPr>
-          <w:b/>
-          <w:color w:val="215E66"/>
-        </w:rPr>
-        <w:t xml:space="preserve">旁白：</w:t>
-      </w:r>
-      <w:r>
-        <w:rPr/>
-        <w:t xml:space="preserve">“木木枭”转过头来，可它的眼睛里</w:t>
-        <w:br/>
-        <w:t xml:space="preserve"/>
-        <w:br/>
-        <w:t xml:space="preserve">却泛着诡异的红光！</w:t>
-        <w:br/>
-        <w:t xml:space="preserve"/>
-        <w:br/>
-        <w:t xml:space="preserve">它发出了完全不属于木木枭的凄厉尖啸！</w:t>
-        <w:br/>
-        <w:t xml:space="preserve"/>
-        <w:br/>
-        <w:t xml:space="preserve">那道身影猛地扭曲、拉长，白色的毛发疯狂生长。</w:t>
-        <w:br/>
-        <w:t xml:space="preserve"/>
-        <w:br/>
-        <w:t xml:space="preserve">赤红的怨念如火焰升腾。它显出了真正的姿态……</w:t>
-        <w:br/>
-        <w:t xml:space="preserve"/>
-        <w:br/>
-        <w:t xml:space="preserve">那是一只巨大的、充满攻击性的</w:t>
-        <w:br/>
-        <w:t xml:space="preserve"/>
-        <w:br/>
-        <w:t xml:space="preserve">洗翠索罗亚克！</w:t>
-      </w:r>
-    </w:p>
-    <w:p>
-      <w:pPr>
-        <w:pStyle w:val="Small"/>
-      </w:pPr>
-      <w:r>
-        <w:rPr/>
-        <w:t xml:space="preserve">来源：s:gText_TaskHisui_ZoroarkReveal</w:t>
-      </w:r>
-    </w:p>
-    <w:p>
-      <w:pPr>
-        <w:pStyle w:val="Heading2"/>
-      </w:pPr>
-      <w:r>
-        <w:rPr/>
-        <w:t xml:space="preserve">索罗亚克消失</w:t>
-      </w:r>
-    </w:p>
-    <w:p>
-      <w:pPr>
-        <w:pStyle w:val="Dialogue"/>
-      </w:pPr>
-      <w:r>
-        <w:rPr>
-          <w:b/>
-          <w:color w:val="215E66"/>
-        </w:rPr>
-        <w:t xml:space="preserve">旁白：</w:t>
-      </w:r>
-      <w:r>
-        <w:rPr/>
-        <w:t xml:space="preserve">索罗亚克消失了……</w:t>
-      </w:r>
-    </w:p>
-    <w:p>
-      <w:pPr>
-        <w:pStyle w:val="Dialogue"/>
-      </w:pPr>
-      <w:r>
-        <w:rPr>
-          <w:b/>
-          <w:color w:val="215E66"/>
-        </w:rPr>
-        <w:t xml:space="preserve">旁白：</w:t>
-      </w:r>
-      <w:r>
-        <w:rPr/>
-        <w:t xml:space="preserve">完成任务:&lt;纯白的魅影&gt;</w:t>
-      </w:r>
-    </w:p>
-    <w:p>
-      <w:pPr>
-        <w:pStyle w:val="Heading2"/>
-      </w:pPr>
-      <w:r>
-        <w:rPr/>
-        <w:t xml:space="preserve">陌生人的惊叹</w:t>
-      </w:r>
-    </w:p>
-    <w:p>
-      <w:pPr>
-        <w:pStyle w:val="Dialogue"/>
-      </w:pPr>
-      <w:r>
-        <w:rPr>
-          <w:b/>
-          <w:color w:val="215E66"/>
-        </w:rPr>
-        <w:t xml:space="preserve">陌生研究员（拉苯）：</w:t>
-      </w:r>
-      <w:r>
-        <w:rPr/>
-        <w:t xml:space="preserve">哎呀呀！真是太惊险了！</w:t>
-        <w:br/>
-        <w:t xml:space="preserve"/>
-        <w:br/>
-        <w:t xml:space="preserve">我都为你捏了一把冷汗啊，年轻的陌生人！</w:t>
-      </w:r>
-    </w:p>
-    <w:p>
-      <w:pPr>
-        <w:pStyle w:val="Heading2"/>
-      </w:pPr>
-      <w:r>
-        <w:rPr/>
-        <w:t xml:space="preserve">找回木木枭</w:t>
-      </w:r>
-    </w:p>
-    <w:p>
-      <w:pPr>
-        <w:pStyle w:val="Dialogue"/>
-      </w:pPr>
-      <w:r>
-        <w:rPr>
-          <w:b/>
-          <w:color w:val="215E66"/>
-        </w:rPr>
-        <w:t xml:space="preserve">拉苯博士：</w:t>
-      </w:r>
-      <w:r>
-        <w:rPr/>
-        <w:t xml:space="preserve">我刚才正在远处观察这片冻土的生态，</w:t>
-        <w:br/>
-        <w:t xml:space="preserve"/>
-        <w:br/>
-        <w:t xml:space="preserve">结果就看见你和那只可怕的索罗亚克战斗！</w:t>
-        <w:br/>
-        <w:t xml:space="preserve"/>
-        <w:br/>
-        <w:t xml:space="preserve">要知道，宝可梦可是非常、非常可怕的生物啊！</w:t>
-        <w:br/>
-        <w:t xml:space="preserve"/>
-        <w:br/>
-        <w:t xml:space="preserve">你竟然能指挥它们作战？对了，刚才这只木木枭</w:t>
-        <w:br/>
-        <w:t xml:space="preserve"/>
-        <w:br/>
-        <w:t xml:space="preserve">一直躲在树洞里瑟瑟发抖……</w:t>
-        <w:br/>
-        <w:t xml:space="preserve"/>
-        <w:br/>
-        <w:t xml:space="preserve">我看它望着你的方向，它是你的宝可梦吗？</w:t>
-        <w:br/>
-        <w:t xml:space="preserve"/>
-        <w:br/>
-        <w:t xml:space="preserve">来，快回到你主人的身边吧。</w:t>
-      </w:r>
-    </w:p>
-    <w:p>
-      <w:pPr>
-        <w:pStyle w:val="Heading2"/>
-      </w:pPr>
-      <w:r>
-        <w:rPr/>
-        <w:t xml:space="preserve">奖励与交付（不写入见闻录正文）</w:t>
-      </w:r>
-    </w:p>
-    <w:p>
-      <w:pPr>
-        <w:pStyle w:val="Note"/>
-      </w:pPr>
-      <w:r>
-        <w:rPr/>
-        <w:t xml:space="preserve">本阶段未见独立发奖指令；洗翠篇统一结算见任务011。</w:t>
-      </w:r>
-    </w:p>
-    <w:p>
-      <w:pPr>
-        <w:pStyle w:val="Heading1"/>
-      </w:pPr>
-      <w:bookmarkStart w:id="10" w:name="task_010"/>
-      <w:r>
-        <w:rPr/>
-        <w:t xml:space="preserve">任务010 在未知的土地上</w:t>
-      </w:r>
-      <w:bookmarkEnd w:id="10"/>
-    </w:p>
-    <w:p>
-      <w:pPr>
-        <w:pStyle w:val="Note"/>
-      </w:pPr>
-      <w:r>
-        <w:rPr/>
-        <w:t xml:space="preserve">与索罗亚克战后连续播放。0xBD5接取、0xBD6告别；拉苯的理想不提前放进刚认识他的页面。</w:t>
-      </w:r>
-    </w:p>
-    <w:p>
-      <w:pPr>
-        <w:pStyle w:val="Normal"/>
-      </w:pPr>
-      <w:r>
-        <w:rPr/>
-        <w:t xml:space="preserve">共2个条件阶段（可选0个），2页详情。接取0xBD5；完成0xBD6。</w:t>
-      </w:r>
-    </w:p>
-    <w:p>
-      <w:pPr>
-        <w:pStyle w:val="Heading2"/>
-      </w:pPr>
-      <w:r>
-        <w:rPr/>
-        <w:t xml:space="preserve">修订流程与解锁条件</w:t>
-      </w:r>
-    </w:p>
-    <w:p>
-      <w:pPr>
-        <w:pStyle w:val="Small"/>
-      </w:pPr>
-      <w:r>
-        <w:rPr/>
-        <w:t xml:space="preserve">阶段1 · 陌生的研究员 · 0xBD5</w:t>
-      </w:r>
-    </w:p>
-    <w:p>
-      <w:pPr>
-        <w:pStyle w:val="Dialogue"/>
-      </w:pPr>
-      <w:r>
-        <w:rPr>
-          <w:b/>
-          <w:color w:val="215E66"/>
-        </w:rPr>
-        <w:t xml:space="preserve">我的见闻：</w:t>
-      </w:r>
-      <w:r>
-        <w:rPr/>
-        <w:t xml:space="preserve">赶来的研究员说。他叫拉苯。</w:t>
-        <w:br/>
-        <w:t xml:space="preserve">这里竟是名为洗翠的地方。</w:t>
-        <w:br/>
-        <w:t xml:space="preserve">他对我能指挥宝可梦十分惊讶。</w:t>
-        <w:br/>
-        <w:t xml:space="preserve">我想听听他眼中的这个世界。</w:t>
-      </w:r>
-    </w:p>
-    <w:p>
-      <w:pPr>
-        <w:pStyle w:val="Small"/>
-      </w:pPr>
-      <w:r>
-        <w:rPr/>
-        <w:t xml:space="preserve">阶段2 · 没有停下的笔 · 0xBD6</w:t>
-      </w:r>
-    </w:p>
-    <w:p>
-      <w:pPr>
-        <w:pStyle w:val="Dialogue"/>
-      </w:pPr>
-      <w:r>
-        <w:rPr>
-          <w:b/>
-          <w:color w:val="215E66"/>
-        </w:rPr>
-        <w:t xml:space="preserve">我的见闻：</w:t>
-      </w:r>
-      <w:r>
-        <w:rPr/>
-        <w:t xml:space="preserve">拉苯想把所有宝可梦记录进图鉴。</w:t>
-        <w:br/>
-        <w:t xml:space="preserve">即使旁人不理解。他也不会放弃。</w:t>
-        <w:br/>
-        <w:t xml:space="preserve">分别时。他托我去看看未来。</w:t>
-        <w:br/>
-        <w:t xml:space="preserve">这份愿望。我一定会记住。</w:t>
-      </w:r>
-    </w:p>
-    <w:p>
-      <w:pPr>
-        <w:pStyle w:val="Heading2"/>
-      </w:pPr>
-      <w:r>
-        <w:rPr/>
-        <w:t xml:space="preserve">场景对白与分支</w:t>
-      </w:r>
-    </w:p>
-    <w:p>
-      <w:pPr>
-        <w:pStyle w:val="Heading2"/>
-      </w:pPr>
-      <w:r>
-        <w:rPr/>
-        <w:t xml:space="preserve">拉苯自我介绍</w:t>
-      </w:r>
-    </w:p>
-    <w:p>
-      <w:pPr>
-        <w:pStyle w:val="Dialogue"/>
-      </w:pPr>
-      <w:r>
-        <w:rPr>
-          <w:b/>
-          <w:color w:val="215E66"/>
-        </w:rPr>
-        <w:t xml:space="preserve">拉苯博士：</w:t>
-      </w:r>
-      <w:r>
-        <w:rPr/>
-        <w:t xml:space="preserve">噢，请原谅我的失礼。我还没自我介绍。</w:t>
-        <w:br/>
-        <w:t xml:space="preserve"/>
-        <w:br/>
-        <w:t xml:space="preserve">我是拉苯，是洗翠地区的</w:t>
-        <w:br/>
-        <w:t xml:space="preserve"/>
-        <w:br/>
-        <w:t xml:space="preserve">宝可梦研究员。</w:t>
-      </w:r>
-    </w:p>
-    <w:p>
-      <w:pPr>
-        <w:pStyle w:val="Heading2"/>
-      </w:pPr>
-      <w:r>
-        <w:rPr/>
-        <w:t xml:space="preserve">三只伙伴带来的启发</w:t>
-      </w:r>
-    </w:p>
-    <w:p>
-      <w:pPr>
-        <w:pStyle w:val="Dialogue"/>
-      </w:pPr>
-      <w:r>
-        <w:rPr>
-          <w:b/>
-          <w:color w:val="215E66"/>
-        </w:rPr>
-        <w:t xml:space="preserve">拉苯博士：</w:t>
-      </w:r>
-      <w:r>
-        <w:rPr/>
-        <w:t xml:space="preserve">哦哦哦！等等！你身边跟着的</w:t>
-        <w:br/>
-        <w:t xml:space="preserve"/>
-        <w:br/>
-        <w:t xml:space="preserve">那两个小家伙是……</w:t>
-        <w:br/>
-        <w:t xml:space="preserve"/>
-        <w:br/>
-        <w:t xml:space="preserve">火球鼠，还有水水獭？！这真是不可思议！</w:t>
-        <w:br/>
-        <w:t xml:space="preserve"/>
-        <w:br/>
-        <w:t xml:space="preserve">火球鼠、水水獭、木木枭……草克制水，水克制火，</w:t>
-        <w:br/>
-        <w:t xml:space="preserve"/>
-        <w:br/>
-        <w:t xml:space="preserve">火又克制草！</w:t>
-        <w:br/>
-        <w:t xml:space="preserve"/>
-        <w:br/>
-        <w:t xml:space="preserve">这三只宝可梦构成了完美又和谐的</w:t>
-        <w:br/>
-        <w:t xml:space="preserve"/>
-        <w:br/>
-        <w:t xml:space="preserve">属性三角关系啊！</w:t>
-        <w:br/>
-        <w:t xml:space="preserve"/>
-        <w:br/>
-        <w:t xml:space="preserve">原来如此……我懂了！</w:t>
-        <w:br/>
-        <w:t xml:space="preserve"/>
-        <w:br/>
-        <w:t xml:space="preserve">这是一个绝妙的启发！我最近正发愁，</w:t>
-        <w:br/>
-        <w:t xml:space="preserve"/>
-        <w:br/>
-        <w:t xml:space="preserve">该挑什么宝可梦来引导新人调查队员。</w:t>
-        <w:br/>
-        <w:t xml:space="preserve"/>
-        <w:br/>
-        <w:t xml:space="preserve">如果把这三只彼此制衡、</w:t>
-        <w:br/>
-        <w:t xml:space="preserve"/>
-        <w:br/>
-        <w:t xml:space="preserve">又能够和谐相处的宝可梦，作为初学者的初始搭档……</w:t>
-        <w:br/>
-        <w:t xml:space="preserve"/>
-        <w:br/>
-        <w:t xml:space="preserve">也许能大大减轻人们接触宝可梦时的恐惧呢！</w:t>
-        <w:br/>
-        <w:t xml:space="preserve"/>
-        <w:br/>
-        <w:t xml:space="preserve">看到它们对你如此依恋的样子，</w:t>
-        <w:br/>
-        <w:t xml:space="preserve"/>
-        <w:br/>
-        <w:t xml:space="preserve">真是让人感慨万千……</w:t>
-      </w:r>
-    </w:p>
-    <w:p>
-      <w:pPr>
-        <w:pStyle w:val="Heading2"/>
-      </w:pPr>
-      <w:r>
-        <w:rPr/>
-        <w:t xml:space="preserve">关于人与宝可梦的未来</w:t>
-      </w:r>
-    </w:p>
-    <w:p>
-      <w:pPr>
-        <w:pStyle w:val="Dialogue"/>
-      </w:pPr>
-      <w:r>
-        <w:rPr>
-          <w:b/>
-          <w:color w:val="215E66"/>
-        </w:rPr>
-        <w:t xml:space="preserve">拉苯博士：</w:t>
-      </w:r>
-      <w:r>
-        <w:rPr/>
-        <w:t xml:space="preserve">你知道吗？在这个洗翠地区，人们对宝可梦充满恐惧。</w:t>
-        <w:br/>
-        <w:t xml:space="preserve"/>
-        <w:br/>
-        <w:t xml:space="preserve">大家把它们当成会伤人的野兽，</w:t>
-        <w:br/>
-        <w:t xml:space="preserve"/>
-        <w:br/>
-        <w:t xml:space="preserve">当成不可理喻的怪物。</w:t>
-        <w:br/>
-        <w:t xml:space="preserve"/>
-        <w:br/>
-        <w:t xml:space="preserve">甚至连银河队的马加木老大，</w:t>
-        <w:br/>
-        <w:t xml:space="preserve"/>
-        <w:br/>
-        <w:t xml:space="preserve">也总是斥责我。</w:t>
-        <w:br/>
-        <w:t xml:space="preserve"/>
-        <w:br/>
-        <w:t xml:space="preserve">在他眼里，我每天去观察、记录这些生物的生态，</w:t>
-        <w:br/>
-        <w:t xml:space="preserve"/>
-        <w:br/>
-        <w:t xml:space="preserve">不过是毫无用处的过家家行为。</w:t>
-        <w:br/>
-        <w:t xml:space="preserve"/>
-        <w:br/>
-        <w:t xml:space="preserve">不去斩除危险，反而去研究危险，</w:t>
-        <w:br/>
-        <w:t xml:space="preserve"/>
-        <w:br/>
-        <w:t xml:space="preserve">简直是愚不可及。</w:t>
-        <w:br/>
-        <w:t xml:space="preserve"/>
-        <w:br/>
-        <w:t xml:space="preserve">但是……我有一个梦想！我要把所有宝可梦的生态</w:t>
-        <w:br/>
-        <w:t xml:space="preserve"/>
-        <w:br/>
-        <w:t xml:space="preserve">都记录下来，</w:t>
-        <w:br/>
-        <w:t xml:space="preserve"/>
-        <w:br/>
-        <w:t xml:space="preserve">我要编纂出这个世界上第一本宝可梦图鉴！</w:t>
-        <w:br/>
-        <w:t xml:space="preserve"/>
-        <w:br/>
-        <w:t xml:space="preserve">因为恐惧往往来源于未知。只要人们了解它们的习性，</w:t>
-        <w:br/>
-        <w:t xml:space="preserve"/>
-        <w:br/>
-        <w:t xml:space="preserve">知道它们也会像这样互相依靠……</w:t>
-        <w:br/>
-        <w:t xml:space="preserve"/>
-        <w:br/>
-        <w:t xml:space="preserve">恐惧就会变成好奇，好奇就会变成理解！</w:t>
-        <w:br/>
-        <w:t xml:space="preserve"/>
-        <w:br/>
-        <w:t xml:space="preserve">哪怕马加木老大不认可我，哪怕我注定是个怪人，</w:t>
-        <w:br/>
-        <w:t xml:space="preserve"/>
-        <w:br/>
-        <w:t xml:space="preserve">一个不被理解的怪人，我也绝不会停下记录的笔！</w:t>
-        <w:br/>
-        <w:t xml:space="preserve"/>
-        <w:br/>
-        <w:t xml:space="preserve">我相信，这份记录会像种子一样</w:t>
-        <w:br/>
-        <w:t xml:space="preserve"/>
-        <w:br/>
-        <w:t xml:space="preserve">在时光里流传下去。</w:t>
-        <w:br/>
-        <w:t xml:space="preserve"/>
-        <w:br/>
-        <w:t xml:space="preserve">也许要等上一百年，甚至几百年……</w:t>
-        <w:br/>
-        <w:t xml:space="preserve"/>
-        <w:br/>
-        <w:t xml:space="preserve">但我坚信，在遥远的未来，人类一定能和这些奇妙生物</w:t>
-        <w:br/>
-        <w:t xml:space="preserve"/>
-        <w:br/>
-        <w:t xml:space="preserve">消除隔阂，成为并肩同行的伙伴！</w:t>
-      </w:r>
-    </w:p>
-    <w:p>
-      <w:pPr>
-        <w:pStyle w:val="Dialogue"/>
-      </w:pPr>
-      <w:r>
-        <w:rPr>
-          <w:b/>
-          <w:color w:val="215E66"/>
-        </w:rPr>
-        <w:t xml:space="preserve">拉苯博士：</w:t>
-      </w:r>
-      <w:r>
-        <w:rPr/>
-        <w:t xml:space="preserve">拥有这种平衡力量的你，简直是天生的调查队员！</w:t>
-        <w:br/>
-        <w:t xml:space="preserve"/>
-        <w:br/>
-        <w:t xml:space="preserve">如果可以的话，真希望你能加入我们，</w:t>
-        <w:br/>
-        <w:t xml:space="preserve"/>
-        <w:br/>
-        <w:t xml:space="preserve">一起来见证那个未来的开端啊！</w:t>
-      </w:r>
-    </w:p>
-    <w:p>
-      <w:pPr>
-        <w:pStyle w:val="Heading2"/>
-      </w:pPr>
-      <w:r>
-        <w:rPr/>
-        <w:t xml:space="preserve">时空分离时的告别</w:t>
-      </w:r>
-    </w:p>
-    <w:p>
-      <w:pPr>
-        <w:pStyle w:val="Dialogue"/>
-      </w:pPr>
-      <w:r>
-        <w:rPr>
-          <w:b/>
-          <w:color w:val="215E66"/>
-        </w:rPr>
-        <w:t xml:space="preserve">拉苯博士：</w:t>
-      </w:r>
-      <w:r>
-        <w:rPr/>
-        <w:t xml:space="preserve">消失了吗！？</w:t>
-        <w:br/>
-        <w:t xml:space="preserve"/>
-        <w:br/>
-        <w:t xml:space="preserve">看来，洗翠地区并不是你该留下的地方。</w:t>
-        <w:br/>
-        <w:t xml:space="preserve"/>
-        <w:br/>
-        <w:t xml:space="preserve">虽然只是短短一会儿，但很高兴认识你。</w:t>
-        <w:br/>
-        <w:t xml:space="preserve"/>
-        <w:br/>
-        <w:t xml:space="preserve">请替我去看看那个……你所在的未来吧……！</w:t>
-      </w:r>
-    </w:p>
-    <w:p>
-      <w:pPr>
-        <w:pStyle w:val="Dialogue"/>
-      </w:pPr>
-      <w:r>
-        <w:rPr>
-          <w:b/>
-          <w:color w:val="215E66"/>
-        </w:rPr>
-        <w:t xml:space="preserve">拉苯博士：</w:t>
-      </w:r>
-      <w:r>
-        <w:rPr/>
-        <w:t xml:space="preserve">完成任务:&lt;在未知的土地上&gt;</w:t>
-      </w:r>
-    </w:p>
-    <w:p>
-      <w:pPr>
-        <w:pStyle w:val="Heading2"/>
-      </w:pPr>
-      <w:r>
-        <w:rPr/>
-        <w:t xml:space="preserve">奖励与交付（不写入见闻录正文）</w:t>
-      </w:r>
-    </w:p>
-    <w:p>
-      <w:pPr>
-        <w:pStyle w:val="Note"/>
-      </w:pPr>
-      <w:r>
-        <w:rPr/>
-        <w:t xml:space="preserve">回到现代后的道具、15BP和20000元归任务011统一结算，本章不重复累计。</w:t>
+        <w:t xml:space="preserve">开启下一阶段</w:t>
       </w:r>
     </w:p>
     <w:p>

</xml_diff>

<commit_message>
同步主仓库 wiki 更新 (ca2c6f3c5e79a1b0a8d75396c103bfea765db986)
</commit_message>
<xml_diff>
--- a/docs/sidequests/downloads/sidequest-scriptbook-20261004.docx
+++ b/docs/sidequests/downloads/sidequest-scriptbook-20261004.docx
@@ -11297,11 +11297,11 @@
     </w:p>
     <w:p>
       <w:pPr>
-        <w:pStyle w:val="Note"/>
-      </w:pPr>
-      <w:r>
-        <w:rPr/>
-        <w:t xml:space="preserve">这一阶段确认的是U盘交接和修复剧情，未见独立金钱／BP发放；多边兽与12000元、10BP在任务019结算。</w:t>
+        <w:pStyle w:val="Normal"/>
+      </w:pPr>
+      <w:r>
+        <w:rPr/>
+        <w:t xml:space="preserve">开启下一阶段</w:t>
       </w:r>
     </w:p>
     <w:p>

</xml_diff>